<commit_message>
2nd assignment task 2 done
</commit_message>
<xml_diff>
--- a/Networking_Assignment.docx
+++ b/Networking_Assignment.docx
@@ -355,7 +355,6 @@
           <w:lang w:val="en-IN"/>
         </w:rPr>
       </w:pPr>
-      <w:proofErr w:type="gramStart"/>
       <w:r>
         <w:rPr>
           <w:lang w:val="en-IN"/>
@@ -372,14 +371,7 @@
         <w:rPr>
           <w:lang w:val="en-IN"/>
         </w:rPr>
-        <w:t xml:space="preserve"> Domain</w:t>
-      </w:r>
-      <w:proofErr w:type="gramEnd"/>
-      <w:r>
-        <w:rPr>
-          <w:lang w:val="en-IN"/>
-        </w:rPr>
-        <w:t xml:space="preserve"> being resolved</w:t>
+        <w:t xml:space="preserve"> Domain being resolved</w:t>
       </w:r>
       <w:r>
         <w:rPr>
@@ -664,17 +656,15 @@
         <w:rPr>
           <w:lang w:val="en-IN"/>
         </w:rPr>
+        <w:br/>
+      </w:r>
+      <w:r>
+        <w:rPr>
+          <w:lang w:val="en-IN"/>
+        </w:rPr>
         <w:lastRenderedPageBreak/>
-        <w:br/>
         <w:t>Final IP Address</w:t>
       </w:r>
-    </w:p>
-    <w:p>
-      <w:pPr>
-        <w:rPr>
-          <w:lang w:val="en-IN"/>
-        </w:rPr>
-      </w:pPr>
       <w:r>
         <w:rPr>
           <w:lang w:val="en-IN"/>
@@ -714,6 +704,537 @@
             </a:graphic>
           </wp:inline>
         </w:drawing>
+      </w:r>
+      <w:r>
+        <w:rPr>
+          <w:lang w:val="en-IN"/>
+        </w:rPr>
+        <w:br/>
+      </w:r>
+      <w:r>
+        <w:rPr>
+          <w:lang w:val="en-IN"/>
+        </w:rPr>
+        <w:br/>
+        <w:t>Task B)</w:t>
+      </w:r>
+      <w:r>
+        <w:rPr>
+          <w:lang w:val="en-IN"/>
+        </w:rPr>
+        <w:br/>
+      </w:r>
+      <w:r>
+        <w:rPr>
+          <w:lang w:val="en-IN"/>
+        </w:rPr>
+        <w:br/>
+      </w:r>
+      <w:r>
+        <w:rPr>
+          <w:lang w:val="en-IN"/>
+        </w:rPr>
+        <w:t>The hosts file is located at C:\Windows\System32\drivers\etc\hosts.</w:t>
+      </w:r>
+    </w:p>
+    <w:p>
+      <w:pPr>
+        <w:rPr>
+          <w:lang w:val="en-IN"/>
+        </w:rPr>
+      </w:pPr>
+      <w:r>
+        <w:rPr>
+          <w:lang w:val="en-IN"/>
+        </w:rPr>
+        <w:t>127.0.0.1 is the IPv4 loopback address, representing the local computer.</w:t>
+      </w:r>
+    </w:p>
+    <w:p>
+      <w:pPr>
+        <w:rPr>
+          <w:lang w:val="en-IN"/>
+        </w:rPr>
+      </w:pPr>
+      <w:r>
+        <w:rPr>
+          <w:lang w:val="en-IN"/>
+        </w:rPr>
+        <w:t>The hosts file is checked before external DNS servers.</w:t>
+      </w:r>
+      <w:r>
+        <w:rPr>
+          <w:lang w:val="en-IN"/>
+        </w:rPr>
+        <w:br/>
+      </w:r>
+      <w:r>
+        <w:rPr>
+          <w:lang w:val="en-IN"/>
+        </w:rPr>
+        <w:br/>
+      </w:r>
+      <w:r>
+        <w:rPr>
+          <w:lang w:val="en-IN"/>
+        </w:rPr>
+        <w:t xml:space="preserve">127.0.0.1    </w:t>
+      </w:r>
+      <w:proofErr w:type="spellStart"/>
+      <w:r>
+        <w:rPr>
+          <w:lang w:val="en-IN"/>
+        </w:rPr>
+        <w:t>mypc.test</w:t>
+      </w:r>
+      <w:proofErr w:type="spellEnd"/>
+      <w:r>
+        <w:rPr>
+          <w:lang w:val="en-IN"/>
+        </w:rPr>
+        <w:t xml:space="preserve">  -&gt; Added to host file</w:t>
+      </w:r>
+      <w:r>
+        <w:rPr>
+          <w:lang w:val="en-IN"/>
+        </w:rPr>
+        <w:br/>
+      </w:r>
+      <w:r>
+        <w:rPr>
+          <w:lang w:val="en-IN"/>
+        </w:rPr>
+        <w:br/>
+      </w:r>
+      <w:r>
+        <w:rPr>
+          <w:lang w:val="en-IN"/>
+        </w:rPr>
+        <w:drawing>
+          <wp:inline distT="0" distB="0" distL="0" distR="0" wp14:anchorId="3728706D" wp14:editId="256DE0CA">
+            <wp:extent cx="5934903" cy="2915057"/>
+            <wp:effectExtent l="0" t="0" r="0" b="0"/>
+            <wp:docPr id="121563971" name="Picture 1"/>
+            <wp:cNvGraphicFramePr>
+              <a:graphicFrameLocks xmlns:a="http://schemas.openxmlformats.org/drawingml/2006/main" noChangeAspect="1"/>
+            </wp:cNvGraphicFramePr>
+            <a:graphic xmlns:a="http://schemas.openxmlformats.org/drawingml/2006/main">
+              <a:graphicData uri="http://schemas.openxmlformats.org/drawingml/2006/picture">
+                <pic:pic xmlns:pic="http://schemas.openxmlformats.org/drawingml/2006/picture">
+                  <pic:nvPicPr>
+                    <pic:cNvPr id="121563971" name=""/>
+                    <pic:cNvPicPr/>
+                  </pic:nvPicPr>
+                  <pic:blipFill>
+                    <a:blip r:embed="rId9"/>
+                    <a:stretch>
+                      <a:fillRect/>
+                    </a:stretch>
+                  </pic:blipFill>
+                  <pic:spPr>
+                    <a:xfrm>
+                      <a:off x="0" y="0"/>
+                      <a:ext cx="5934903" cy="2915057"/>
+                    </a:xfrm>
+                    <a:prstGeom prst="rect">
+                      <a:avLst/>
+                    </a:prstGeom>
+                  </pic:spPr>
+                </pic:pic>
+              </a:graphicData>
+            </a:graphic>
+          </wp:inline>
+        </w:drawing>
+      </w:r>
+      <w:r>
+        <w:rPr>
+          <w:lang w:val="en-IN"/>
+        </w:rPr>
+        <w:br/>
+      </w:r>
+      <w:r>
+        <w:rPr>
+          <w:lang w:val="en-IN"/>
+        </w:rPr>
+        <w:br/>
+        <w:t>After commenting the line in host file</w:t>
+      </w:r>
+      <w:r>
+        <w:rPr>
+          <w:lang w:val="en-IN"/>
+        </w:rPr>
+        <w:br/>
+      </w:r>
+      <w:r>
+        <w:rPr>
+          <w:lang w:val="en-IN"/>
+        </w:rPr>
+        <w:br/>
+      </w:r>
+      <w:r>
+        <w:rPr>
+          <w:lang w:val="en-IN"/>
+        </w:rPr>
+        <w:drawing>
+          <wp:inline distT="0" distB="0" distL="0" distR="0" wp14:anchorId="464E3C97" wp14:editId="25755B03">
+            <wp:extent cx="5943600" cy="464820"/>
+            <wp:effectExtent l="0" t="0" r="0" b="0"/>
+            <wp:docPr id="912109865" name="Picture 1"/>
+            <wp:cNvGraphicFramePr>
+              <a:graphicFrameLocks xmlns:a="http://schemas.openxmlformats.org/drawingml/2006/main" noChangeAspect="1"/>
+            </wp:cNvGraphicFramePr>
+            <a:graphic xmlns:a="http://schemas.openxmlformats.org/drawingml/2006/main">
+              <a:graphicData uri="http://schemas.openxmlformats.org/drawingml/2006/picture">
+                <pic:pic xmlns:pic="http://schemas.openxmlformats.org/drawingml/2006/picture">
+                  <pic:nvPicPr>
+                    <pic:cNvPr id="912109865" name=""/>
+                    <pic:cNvPicPr/>
+                  </pic:nvPicPr>
+                  <pic:blipFill>
+                    <a:blip r:embed="rId10"/>
+                    <a:stretch>
+                      <a:fillRect/>
+                    </a:stretch>
+                  </pic:blipFill>
+                  <pic:spPr>
+                    <a:xfrm>
+                      <a:off x="0" y="0"/>
+                      <a:ext cx="5943600" cy="464820"/>
+                    </a:xfrm>
+                    <a:prstGeom prst="rect">
+                      <a:avLst/>
+                    </a:prstGeom>
+                  </pic:spPr>
+                </pic:pic>
+              </a:graphicData>
+            </a:graphic>
+          </wp:inline>
+        </w:drawing>
+      </w:r>
+      <w:r>
+        <w:rPr>
+          <w:lang w:val="en-IN"/>
+        </w:rPr>
+        <w:br/>
+      </w:r>
+      <w:r>
+        <w:rPr>
+          <w:lang w:val="en-IN"/>
+        </w:rPr>
+        <w:br/>
+      </w:r>
+      <w:r>
+        <w:rPr>
+          <w:lang w:val="en-IN"/>
+        </w:rPr>
+        <w:br/>
+      </w:r>
+      <w:r>
+        <w:rPr>
+          <w:lang w:val="en-IN"/>
+        </w:rPr>
+        <w:lastRenderedPageBreak/>
+        <w:t>Question 2)</w:t>
+      </w:r>
+      <w:r>
+        <w:t xml:space="preserve"> </w:t>
+      </w:r>
+      <w:r>
+        <w:rPr>
+          <w:lang w:val="en-IN"/>
+        </w:rPr>
+        <w:t>Reverse and Forward Proxy Configuration</w:t>
+      </w:r>
+      <w:r>
+        <w:rPr>
+          <w:lang w:val="en-IN"/>
+        </w:rPr>
+        <w:br/>
+      </w:r>
+      <w:r>
+        <w:rPr>
+          <w:lang w:val="en-IN"/>
+        </w:rPr>
+        <w:br/>
+        <w:t>Reverse Proxy for BE server</w:t>
+      </w:r>
+      <w:r>
+        <w:rPr>
+          <w:lang w:val="en-IN"/>
+        </w:rPr>
+        <w:br/>
+      </w:r>
+      <w:r>
+        <w:rPr>
+          <w:lang w:val="en-IN"/>
+        </w:rPr>
+        <w:br/>
+      </w:r>
+      <w:r>
+        <w:rPr>
+          <w:lang w:val="en-IN"/>
+        </w:rPr>
+        <w:drawing>
+          <wp:inline distT="0" distB="0" distL="0" distR="0" wp14:anchorId="7D4FC03E" wp14:editId="40862533">
+            <wp:extent cx="5943600" cy="1732915"/>
+            <wp:effectExtent l="0" t="0" r="0" b="635"/>
+            <wp:docPr id="692553302" name="Picture 1"/>
+            <wp:cNvGraphicFramePr>
+              <a:graphicFrameLocks xmlns:a="http://schemas.openxmlformats.org/drawingml/2006/main" noChangeAspect="1"/>
+            </wp:cNvGraphicFramePr>
+            <a:graphic xmlns:a="http://schemas.openxmlformats.org/drawingml/2006/main">
+              <a:graphicData uri="http://schemas.openxmlformats.org/drawingml/2006/picture">
+                <pic:pic xmlns:pic="http://schemas.openxmlformats.org/drawingml/2006/picture">
+                  <pic:nvPicPr>
+                    <pic:cNvPr id="692553302" name=""/>
+                    <pic:cNvPicPr/>
+                  </pic:nvPicPr>
+                  <pic:blipFill>
+                    <a:blip r:embed="rId11"/>
+                    <a:stretch>
+                      <a:fillRect/>
+                    </a:stretch>
+                  </pic:blipFill>
+                  <pic:spPr>
+                    <a:xfrm>
+                      <a:off x="0" y="0"/>
+                      <a:ext cx="5943600" cy="1732915"/>
+                    </a:xfrm>
+                    <a:prstGeom prst="rect">
+                      <a:avLst/>
+                    </a:prstGeom>
+                  </pic:spPr>
+                </pic:pic>
+              </a:graphicData>
+            </a:graphic>
+          </wp:inline>
+        </w:drawing>
+      </w:r>
+      <w:r>
+        <w:rPr>
+          <w:lang w:val="en-IN"/>
+        </w:rPr>
+        <w:br/>
+      </w:r>
+      <w:r>
+        <w:rPr>
+          <w:lang w:val="en-IN"/>
+        </w:rPr>
+        <w:br/>
+        <w:t>Reverse Proxy Configuration</w:t>
+      </w:r>
+      <w:r>
+        <w:rPr>
+          <w:lang w:val="en-IN"/>
+        </w:rPr>
+        <w:br/>
+      </w:r>
+      <w:r>
+        <w:rPr>
+          <w:lang w:val="en-IN"/>
+        </w:rPr>
+        <w:drawing>
+          <wp:inline distT="0" distB="0" distL="0" distR="0" wp14:anchorId="73692B7B" wp14:editId="324F23B4">
+            <wp:extent cx="5943600" cy="2536190"/>
+            <wp:effectExtent l="0" t="0" r="0" b="0"/>
+            <wp:docPr id="380302965" name="Picture 1"/>
+            <wp:cNvGraphicFramePr>
+              <a:graphicFrameLocks xmlns:a="http://schemas.openxmlformats.org/drawingml/2006/main" noChangeAspect="1"/>
+            </wp:cNvGraphicFramePr>
+            <a:graphic xmlns:a="http://schemas.openxmlformats.org/drawingml/2006/main">
+              <a:graphicData uri="http://schemas.openxmlformats.org/drawingml/2006/picture">
+                <pic:pic xmlns:pic="http://schemas.openxmlformats.org/drawingml/2006/picture">
+                  <pic:nvPicPr>
+                    <pic:cNvPr id="380302965" name=""/>
+                    <pic:cNvPicPr/>
+                  </pic:nvPicPr>
+                  <pic:blipFill>
+                    <a:blip r:embed="rId12"/>
+                    <a:stretch>
+                      <a:fillRect/>
+                    </a:stretch>
+                  </pic:blipFill>
+                  <pic:spPr>
+                    <a:xfrm>
+                      <a:off x="0" y="0"/>
+                      <a:ext cx="5943600" cy="2536190"/>
+                    </a:xfrm>
+                    <a:prstGeom prst="rect">
+                      <a:avLst/>
+                    </a:prstGeom>
+                  </pic:spPr>
+                </pic:pic>
+              </a:graphicData>
+            </a:graphic>
+          </wp:inline>
+        </w:drawing>
+      </w:r>
+      <w:r>
+        <w:rPr>
+          <w:lang w:val="en-IN"/>
+        </w:rPr>
+        <w:br/>
+      </w:r>
+      <w:r>
+        <w:rPr>
+          <w:lang w:val="en-IN"/>
+        </w:rPr>
+        <w:br/>
+      </w:r>
+    </w:p>
+    <w:p>
+      <w:pPr>
+        <w:rPr>
+          <w:lang w:val="en-IN"/>
+        </w:rPr>
+      </w:pPr>
+    </w:p>
+    <w:p>
+      <w:pPr>
+        <w:rPr>
+          <w:lang w:val="en-IN"/>
+        </w:rPr>
+      </w:pPr>
+      <w:r>
+        <w:rPr>
+          <w:lang w:val="en-IN"/>
+        </w:rPr>
+        <w:lastRenderedPageBreak/>
+        <w:t>Forward Proxy setup</w:t>
+      </w:r>
+      <w:r>
+        <w:rPr>
+          <w:lang w:val="en-IN"/>
+        </w:rPr>
+        <w:br/>
+      </w:r>
+      <w:r>
+        <w:rPr>
+          <w:lang w:val="en-IN"/>
+        </w:rPr>
+        <w:drawing>
+          <wp:inline distT="0" distB="0" distL="0" distR="0" wp14:anchorId="4FAA5A23" wp14:editId="23A7DB4E">
+            <wp:extent cx="5943600" cy="2814955"/>
+            <wp:effectExtent l="0" t="0" r="0" b="4445"/>
+            <wp:docPr id="1948906752" name="Picture 1"/>
+            <wp:cNvGraphicFramePr>
+              <a:graphicFrameLocks xmlns:a="http://schemas.openxmlformats.org/drawingml/2006/main" noChangeAspect="1"/>
+            </wp:cNvGraphicFramePr>
+            <a:graphic xmlns:a="http://schemas.openxmlformats.org/drawingml/2006/main">
+              <a:graphicData uri="http://schemas.openxmlformats.org/drawingml/2006/picture">
+                <pic:pic xmlns:pic="http://schemas.openxmlformats.org/drawingml/2006/picture">
+                  <pic:nvPicPr>
+                    <pic:cNvPr id="1948906752" name=""/>
+                    <pic:cNvPicPr/>
+                  </pic:nvPicPr>
+                  <pic:blipFill>
+                    <a:blip r:embed="rId13"/>
+                    <a:stretch>
+                      <a:fillRect/>
+                    </a:stretch>
+                  </pic:blipFill>
+                  <pic:spPr>
+                    <a:xfrm>
+                      <a:off x="0" y="0"/>
+                      <a:ext cx="5943600" cy="2814955"/>
+                    </a:xfrm>
+                    <a:prstGeom prst="rect">
+                      <a:avLst/>
+                    </a:prstGeom>
+                  </pic:spPr>
+                </pic:pic>
+              </a:graphicData>
+            </a:graphic>
+          </wp:inline>
+        </w:drawing>
+      </w:r>
+      <w:r>
+        <w:rPr>
+          <w:lang w:val="en-IN"/>
+        </w:rPr>
+        <w:br/>
+      </w:r>
+      <w:r>
+        <w:rPr>
+          <w:lang w:val="en-IN"/>
+        </w:rPr>
+        <w:br/>
+      </w:r>
+      <w:r>
+        <w:rPr>
+          <w:lang w:val="en-IN"/>
+        </w:rPr>
+        <w:t>test forward proxy with curl</w:t>
+      </w:r>
+      <w:r>
+        <w:rPr>
+          <w:lang w:val="en-IN"/>
+        </w:rPr>
+        <w:br/>
+      </w:r>
+      <w:r>
+        <w:rPr>
+          <w:lang w:val="en-IN"/>
+        </w:rPr>
+        <w:br/>
+      </w:r>
+      <w:r>
+        <w:rPr>
+          <w:lang w:val="en-IN"/>
+        </w:rPr>
+        <w:drawing>
+          <wp:inline distT="0" distB="0" distL="0" distR="0" wp14:anchorId="66A420E8" wp14:editId="4681A91E">
+            <wp:extent cx="5943600" cy="2385060"/>
+            <wp:effectExtent l="0" t="0" r="0" b="0"/>
+            <wp:docPr id="1427505557" name="Picture 1"/>
+            <wp:cNvGraphicFramePr>
+              <a:graphicFrameLocks xmlns:a="http://schemas.openxmlformats.org/drawingml/2006/main" noChangeAspect="1"/>
+            </wp:cNvGraphicFramePr>
+            <a:graphic xmlns:a="http://schemas.openxmlformats.org/drawingml/2006/main">
+              <a:graphicData uri="http://schemas.openxmlformats.org/drawingml/2006/picture">
+                <pic:pic xmlns:pic="http://schemas.openxmlformats.org/drawingml/2006/picture">
+                  <pic:nvPicPr>
+                    <pic:cNvPr id="1427505557" name=""/>
+                    <pic:cNvPicPr/>
+                  </pic:nvPicPr>
+                  <pic:blipFill>
+                    <a:blip r:embed="rId14"/>
+                    <a:stretch>
+                      <a:fillRect/>
+                    </a:stretch>
+                  </pic:blipFill>
+                  <pic:spPr>
+                    <a:xfrm>
+                      <a:off x="0" y="0"/>
+                      <a:ext cx="5943600" cy="2385060"/>
+                    </a:xfrm>
+                    <a:prstGeom prst="rect">
+                      <a:avLst/>
+                    </a:prstGeom>
+                  </pic:spPr>
+                </pic:pic>
+              </a:graphicData>
+            </a:graphic>
+          </wp:inline>
+        </w:drawing>
+      </w:r>
+      <w:r>
+        <w:rPr>
+          <w:lang w:val="en-IN"/>
+        </w:rPr>
+        <w:br/>
+      </w:r>
+      <w:r>
+        <w:rPr>
+          <w:lang w:val="en-IN"/>
+        </w:rPr>
+        <w:br/>
+      </w:r>
+      <w:r>
+        <w:rPr>
+          <w:lang w:val="en-IN"/>
+        </w:rPr>
+        <w:br/>
       </w:r>
     </w:p>
     <w:sectPr>

</xml_diff>

<commit_message>
2nd assignment task 3 started
</commit_message>
<xml_diff>
--- a/Networking_Assignment.docx
+++ b/Networking_Assignment.docx
@@ -355,6 +355,7 @@
           <w:lang w:val="en-IN"/>
         </w:rPr>
       </w:pPr>
+      <w:proofErr w:type="gramStart"/>
       <w:r>
         <w:rPr>
           <w:lang w:val="en-IN"/>
@@ -371,7 +372,14 @@
         <w:rPr>
           <w:lang w:val="en-IN"/>
         </w:rPr>
-        <w:t xml:space="preserve"> Domain being resolved</w:t>
+        <w:t xml:space="preserve"> Domain</w:t>
+      </w:r>
+      <w:proofErr w:type="gramEnd"/>
+      <w:r>
+        <w:rPr>
+          <w:lang w:val="en-IN"/>
+        </w:rPr>
+        <w:t xml:space="preserve"> being resolved</w:t>
       </w:r>
       <w:r>
         <w:rPr>
@@ -472,19 +480,19 @@
         <w:rPr>
           <w:lang w:val="en-IN"/>
         </w:rPr>
+        <w:t xml:space="preserve">Root Servers </w:t>
+      </w:r>
+      <w:r>
+        <w:rPr>
+          <w:lang w:val="en-IN"/>
+        </w:rPr>
+        <w:br/>
+      </w:r>
+      <w:r>
+        <w:rPr>
+          <w:lang w:val="en-IN"/>
+        </w:rPr>
         <w:lastRenderedPageBreak/>
-        <w:t xml:space="preserve">Root Servers </w:t>
-      </w:r>
-      <w:r>
-        <w:rPr>
-          <w:lang w:val="en-IN"/>
-        </w:rPr>
-        <w:br/>
-      </w:r>
-      <w:r>
-        <w:rPr>
-          <w:lang w:val="en-IN"/>
-        </w:rPr>
         <w:drawing>
           <wp:inline distT="0" distB="0" distL="0" distR="0" wp14:anchorId="0A646A90" wp14:editId="3D54E5F3">
             <wp:extent cx="5943600" cy="2404745"/>
@@ -657,18 +665,13 @@
           <w:lang w:val="en-IN"/>
         </w:rPr>
         <w:br/>
+        <w:t>Final IP Address</w:t>
       </w:r>
       <w:r>
         <w:rPr>
           <w:lang w:val="en-IN"/>
         </w:rPr>
         <w:lastRenderedPageBreak/>
-        <w:t>Final IP Address</w:t>
-      </w:r>
-      <w:r>
-        <w:rPr>
-          <w:lang w:val="en-IN"/>
-        </w:rPr>
         <w:drawing>
           <wp:inline distT="0" distB="0" distL="0" distR="0" wp14:anchorId="4BBB880A" wp14:editId="7F479BC4">
             <wp:extent cx="5943600" cy="1263015"/>
@@ -752,15 +755,30 @@
     </w:p>
     <w:p>
       <w:pPr>
-        <w:rPr>
-          <w:lang w:val="en-IN"/>
-        </w:rPr>
-      </w:pPr>
-      <w:r>
-        <w:rPr>
-          <w:lang w:val="en-IN"/>
-        </w:rPr>
-        <w:t>The hosts file is checked before external DNS servers.</w:t>
+        <w:pStyle w:val="NoSpacing"/>
+        <w:rPr>
+          <w:lang w:val="en-IN"/>
+        </w:rPr>
+      </w:pPr>
+      <w:r>
+        <w:rPr>
+          <w:lang w:val="en-IN"/>
+        </w:rPr>
+        <w:t xml:space="preserve">The </w:t>
+      </w:r>
+      <w:proofErr w:type="gramStart"/>
+      <w:r>
+        <w:rPr>
+          <w:lang w:val="en-IN"/>
+        </w:rPr>
+        <w:t>hosts</w:t>
+      </w:r>
+      <w:proofErr w:type="gramEnd"/>
+      <w:r>
+        <w:rPr>
+          <w:lang w:val="en-IN"/>
+        </w:rPr>
+        <w:t xml:space="preserve"> file is checked before external DNS servers.</w:t>
       </w:r>
       <w:r>
         <w:rPr>
@@ -923,6 +941,62 @@
         </w:rPr>
         <w:br/>
       </w:r>
+    </w:p>
+    <w:p>
+      <w:pPr>
+        <w:pStyle w:val="NoSpacing"/>
+        <w:rPr>
+          <w:lang w:val="en-IN"/>
+        </w:rPr>
+      </w:pPr>
+    </w:p>
+    <w:p>
+      <w:pPr>
+        <w:pStyle w:val="NoSpacing"/>
+        <w:rPr>
+          <w:lang w:val="en-IN"/>
+        </w:rPr>
+      </w:pPr>
+      <w:r>
+        <w:rPr>
+          <w:lang w:val="en-IN"/>
+        </w:rPr>
+        <w:br/>
+      </w:r>
+      <w:r>
+        <w:rPr>
+          <w:lang w:val="en-IN"/>
+        </w:rPr>
+        <w:t>Question 2)</w:t>
+      </w:r>
+      <w:r>
+        <w:t xml:space="preserve"> </w:t>
+      </w:r>
+      <w:r>
+        <w:rPr>
+          <w:lang w:val="en-IN"/>
+        </w:rPr>
+        <w:t>Reverse and Forward Proxy Configuration</w:t>
+      </w:r>
+      <w:r>
+        <w:rPr>
+          <w:lang w:val="en-IN"/>
+        </w:rPr>
+        <w:br/>
+      </w:r>
+      <w:r>
+        <w:rPr>
+          <w:lang w:val="en-IN"/>
+        </w:rPr>
+        <w:br/>
+        <w:t xml:space="preserve"> BE server</w:t>
+      </w:r>
+      <w:r>
+        <w:rPr>
+          <w:lang w:val="en-IN"/>
+        </w:rPr>
+        <w:br/>
+      </w:r>
       <w:r>
         <w:rPr>
           <w:lang w:val="en-IN"/>
@@ -934,46 +1008,6 @@
           <w:lang w:val="en-IN"/>
         </w:rPr>
         <w:lastRenderedPageBreak/>
-        <w:t>Question 2)</w:t>
-      </w:r>
-      <w:r>
-        <w:t xml:space="preserve"> </w:t>
-      </w:r>
-      <w:r>
-        <w:rPr>
-          <w:lang w:val="en-IN"/>
-        </w:rPr>
-        <w:t>Reverse and Forward Proxy Configuration</w:t>
-      </w:r>
-      <w:r>
-        <w:rPr>
-          <w:lang w:val="en-IN"/>
-        </w:rPr>
-        <w:br/>
-      </w:r>
-      <w:r>
-        <w:rPr>
-          <w:lang w:val="en-IN"/>
-        </w:rPr>
-        <w:br/>
-        <w:t>Reverse Proxy for BE server</w:t>
-      </w:r>
-      <w:r>
-        <w:rPr>
-          <w:lang w:val="en-IN"/>
-        </w:rPr>
-        <w:br/>
-      </w:r>
-      <w:r>
-        <w:rPr>
-          <w:lang w:val="en-IN"/>
-        </w:rPr>
-        <w:br/>
-      </w:r>
-      <w:r>
-        <w:rPr>
-          <w:lang w:val="en-IN"/>
-        </w:rPr>
         <w:drawing>
           <wp:inline distT="0" distB="0" distL="0" distR="0" wp14:anchorId="7D4FC03E" wp14:editId="40862533">
             <wp:extent cx="5943600" cy="1732915"/>
@@ -1021,6 +1055,142 @@
           <w:lang w:val="en-IN"/>
         </w:rPr>
         <w:br/>
+      </w:r>
+      <w:r>
+        <w:rPr>
+          <w:lang w:val="en-IN"/>
+        </w:rPr>
+        <w:t xml:space="preserve">python3 -m </w:t>
+      </w:r>
+      <w:proofErr w:type="spellStart"/>
+      <w:proofErr w:type="gramStart"/>
+      <w:r>
+        <w:rPr>
+          <w:lang w:val="en-IN"/>
+        </w:rPr>
+        <w:t>http.server</w:t>
+      </w:r>
+      <w:proofErr w:type="spellEnd"/>
+      <w:proofErr w:type="gramEnd"/>
+      <w:r>
+        <w:rPr>
+          <w:lang w:val="en-IN"/>
+        </w:rPr>
+        <w:t xml:space="preserve"> 9000</w:t>
+      </w:r>
+    </w:p>
+    <w:p>
+      <w:pPr>
+        <w:pStyle w:val="NoSpacing"/>
+        <w:ind w:firstLine="720"/>
+        <w:rPr>
+          <w:lang w:val="en-IN"/>
+        </w:rPr>
+      </w:pPr>
+      <w:r>
+        <w:rPr>
+          <w:lang w:val="en-IN"/>
+        </w:rPr>
+        <w:t>Starts Python’s simple web server on port 9000.</w:t>
+      </w:r>
+    </w:p>
+    <w:p>
+      <w:pPr>
+        <w:pStyle w:val="NoSpacing"/>
+        <w:rPr>
+          <w:lang w:val="en-IN"/>
+        </w:rPr>
+      </w:pPr>
+      <w:r>
+        <w:rPr>
+          <w:lang w:val="en-IN"/>
+        </w:rPr>
+        <w:t>--bind 127.0.0.1</w:t>
+      </w:r>
+    </w:p>
+    <w:p>
+      <w:pPr>
+        <w:pStyle w:val="NoSpacing"/>
+        <w:ind w:firstLine="720"/>
+        <w:rPr>
+          <w:lang w:val="en-IN"/>
+        </w:rPr>
+      </w:pPr>
+      <w:r>
+        <w:rPr>
+          <w:lang w:val="en-IN"/>
+        </w:rPr>
+        <w:t>Makes the backend listen only on the container’s local interface.</w:t>
+      </w:r>
+    </w:p>
+    <w:p>
+      <w:pPr>
+        <w:pStyle w:val="NoSpacing"/>
+        <w:rPr>
+          <w:lang w:val="en-IN"/>
+        </w:rPr>
+      </w:pPr>
+      <w:r>
+        <w:rPr>
+          <w:lang w:val="en-IN"/>
+        </w:rPr>
+        <w:t>--directory /var/www/backend</w:t>
+      </w:r>
+    </w:p>
+    <w:p>
+      <w:pPr>
+        <w:pStyle w:val="NoSpacing"/>
+        <w:ind w:firstLine="720"/>
+        <w:rPr>
+          <w:lang w:val="en-IN"/>
+        </w:rPr>
+      </w:pPr>
+      <w:r>
+        <w:rPr>
+          <w:lang w:val="en-IN"/>
+        </w:rPr>
+        <w:t>Tells Python to serve files from /var/www/backend.</w:t>
+      </w:r>
+    </w:p>
+    <w:p>
+      <w:pPr>
+        <w:pStyle w:val="NoSpacing"/>
+        <w:rPr>
+          <w:lang w:val="en-IN"/>
+        </w:rPr>
+      </w:pPr>
+      <w:r>
+        <w:rPr>
+          <w:lang w:val="en-IN"/>
+        </w:rPr>
+        <w:t>&amp;</w:t>
+      </w:r>
+      <w:r>
+        <w:rPr>
+          <w:lang w:val="en-IN"/>
+        </w:rPr>
+        <w:t xml:space="preserve"> </w:t>
+      </w:r>
+      <w:r>
+        <w:rPr>
+          <w:lang w:val="en-IN"/>
+        </w:rPr>
+        <w:tab/>
+        <w:t>-&gt;run in background</w:t>
+      </w:r>
+    </w:p>
+    <w:p>
+      <w:pPr>
+        <w:pStyle w:val="NoSpacing"/>
+        <w:rPr>
+          <w:lang w:val="en-IN"/>
+        </w:rPr>
+      </w:pPr>
+      <w:r>
+        <w:rPr>
+          <w:lang w:val="en-IN"/>
+        </w:rPr>
+        <w:br/>
         <w:t>Reverse Proxy Configuration</w:t>
       </w:r>
       <w:r>
@@ -1033,10 +1203,148 @@
         <w:rPr>
           <w:lang w:val="en-IN"/>
         </w:rPr>
+        <w:br/>
+      </w:r>
+      <w:r>
+        <w:rPr>
+          <w:lang w:val="en-IN"/>
+        </w:rPr>
+        <w:t>server {</w:t>
+      </w:r>
+    </w:p>
+    <w:p>
+      <w:pPr>
+        <w:pStyle w:val="NoSpacing"/>
+        <w:rPr>
+          <w:lang w:val="en-IN"/>
+        </w:rPr>
+      </w:pPr>
+      <w:r>
+        <w:rPr>
+          <w:lang w:val="en-IN"/>
+        </w:rPr>
+        <w:t xml:space="preserve">    listen 127.0.0.1:8080;</w:t>
+      </w:r>
+    </w:p>
+    <w:p>
+      <w:pPr>
+        <w:pStyle w:val="NoSpacing"/>
+        <w:rPr>
+          <w:lang w:val="en-IN"/>
+        </w:rPr>
+      </w:pPr>
+      <w:r>
+        <w:rPr>
+          <w:lang w:val="en-IN"/>
+        </w:rPr>
+        <w:t xml:space="preserve">    </w:t>
+      </w:r>
+      <w:proofErr w:type="spellStart"/>
+      <w:r>
+        <w:rPr>
+          <w:lang w:val="en-IN"/>
+        </w:rPr>
+        <w:t>server_name</w:t>
+      </w:r>
+      <w:proofErr w:type="spellEnd"/>
+      <w:r>
+        <w:rPr>
+          <w:lang w:val="en-IN"/>
+        </w:rPr>
+        <w:t xml:space="preserve"> localhost;</w:t>
+      </w:r>
+    </w:p>
+    <w:p>
+      <w:pPr>
+        <w:pStyle w:val="NoSpacing"/>
+        <w:rPr>
+          <w:lang w:val="en-IN"/>
+        </w:rPr>
+      </w:pPr>
+      <w:r>
+        <w:rPr>
+          <w:lang w:val="en-IN"/>
+        </w:rPr>
+        <w:t xml:space="preserve">    location / {</w:t>
+      </w:r>
+    </w:p>
+    <w:p>
+      <w:pPr>
+        <w:pStyle w:val="NoSpacing"/>
+        <w:rPr>
+          <w:lang w:val="en-IN"/>
+        </w:rPr>
+      </w:pPr>
+      <w:r>
+        <w:rPr>
+          <w:lang w:val="en-IN"/>
+        </w:rPr>
+        <w:t xml:space="preserve">        </w:t>
+      </w:r>
+      <w:proofErr w:type="spellStart"/>
+      <w:r>
+        <w:rPr>
+          <w:lang w:val="en-IN"/>
+        </w:rPr>
+        <w:t>proxy_pass</w:t>
+      </w:r>
+      <w:proofErr w:type="spellEnd"/>
+      <w:r>
+        <w:rPr>
+          <w:lang w:val="en-IN"/>
+        </w:rPr>
+        <w:t xml:space="preserve"> http://127.0.0.1:9000;</w:t>
+      </w:r>
+    </w:p>
+    <w:p>
+      <w:pPr>
+        <w:pStyle w:val="NoSpacing"/>
+        <w:rPr>
+          <w:lang w:val="en-IN"/>
+        </w:rPr>
+      </w:pPr>
+      <w:r>
+        <w:rPr>
+          <w:lang w:val="en-IN"/>
+        </w:rPr>
+        <w:t xml:space="preserve">    }</w:t>
+      </w:r>
+    </w:p>
+    <w:p>
+      <w:pPr>
+        <w:pStyle w:val="NoSpacing"/>
+        <w:rPr>
+          <w:lang w:val="en-IN"/>
+        </w:rPr>
+      </w:pPr>
+      <w:r>
+        <w:rPr>
+          <w:lang w:val="en-IN"/>
+        </w:rPr>
+        <w:t>}</w:t>
+      </w:r>
+    </w:p>
+    <w:p>
+      <w:pPr>
+        <w:pStyle w:val="NoSpacing"/>
+        <w:rPr>
+          <w:lang w:val="en-IN"/>
+        </w:rPr>
+      </w:pPr>
+      <w:r>
+        <w:rPr>
+          <w:lang w:val="en-IN"/>
+        </w:rPr>
+        <w:br/>
+      </w:r>
+      <w:r>
+        <w:rPr>
+          <w:lang w:val="en-IN"/>
+        </w:rPr>
         <w:drawing>
-          <wp:inline distT="0" distB="0" distL="0" distR="0" wp14:anchorId="73692B7B" wp14:editId="324F23B4">
-            <wp:extent cx="5943600" cy="2536190"/>
-            <wp:effectExtent l="0" t="0" r="0" b="0"/>
+          <wp:inline distT="0" distB="0" distL="0" distR="0" wp14:anchorId="73692B7B" wp14:editId="14704097">
+            <wp:extent cx="6109590" cy="2229183"/>
+            <wp:effectExtent l="0" t="0" r="5715" b="0"/>
             <wp:docPr id="380302965" name="Picture 1"/>
             <wp:cNvGraphicFramePr>
               <a:graphicFrameLocks xmlns:a="http://schemas.openxmlformats.org/drawingml/2006/main" noChangeAspect="1"/>
@@ -1057,7 +1365,7 @@
                   <pic:spPr>
                     <a:xfrm>
                       <a:off x="0" y="0"/>
-                      <a:ext cx="5943600" cy="2536190"/>
+                      <a:ext cx="6156899" cy="2246445"/>
                     </a:xfrm>
                     <a:prstGeom prst="rect">
                       <a:avLst/>
@@ -1081,6 +1389,83 @@
         </w:rPr>
         <w:br/>
       </w:r>
+      <w:r>
+        <w:rPr>
+          <w:lang w:val="en-IN"/>
+        </w:rPr>
+        <w:t>--</w:t>
+      </w:r>
+      <w:proofErr w:type="spellStart"/>
+      <w:r>
+        <w:rPr>
+          <w:lang w:val="en-IN"/>
+        </w:rPr>
+        <w:t>noproxy</w:t>
+      </w:r>
+      <w:proofErr w:type="spellEnd"/>
+      <w:r>
+        <w:rPr>
+          <w:lang w:val="en-IN"/>
+        </w:rPr>
+        <w:t xml:space="preserve"> "*"</w:t>
+      </w:r>
+    </w:p>
+    <w:p>
+      <w:pPr>
+        <w:pStyle w:val="NoSpacing"/>
+        <w:rPr>
+          <w:lang w:val="en-IN"/>
+        </w:rPr>
+      </w:pPr>
+      <w:r>
+        <w:rPr>
+          <w:lang w:val="en-IN"/>
+        </w:rPr>
+        <w:t>Forces curl to connect directly instead of using any proxy environment variables.</w:t>
+      </w:r>
+    </w:p>
+    <w:p>
+      <w:pPr>
+        <w:pStyle w:val="NoSpacing"/>
+        <w:rPr>
+          <w:lang w:val="en-IN"/>
+        </w:rPr>
+      </w:pPr>
+      <w:r>
+        <w:rPr>
+          <w:lang w:val="en-IN"/>
+        </w:rPr>
+        <w:t>-</w:t>
+      </w:r>
+      <w:proofErr w:type="spellStart"/>
+      <w:r>
+        <w:rPr>
+          <w:lang w:val="en-IN"/>
+        </w:rPr>
+        <w:t>i</w:t>
+      </w:r>
+      <w:proofErr w:type="spellEnd"/>
+    </w:p>
+    <w:p>
+      <w:pPr>
+        <w:pStyle w:val="NoSpacing"/>
+        <w:rPr>
+          <w:lang w:val="en-IN"/>
+        </w:rPr>
+      </w:pPr>
+      <w:r>
+        <w:rPr>
+          <w:lang w:val="en-IN"/>
+        </w:rPr>
+        <w:t>Displays the HTTP response headers.</w:t>
+      </w:r>
+    </w:p>
+    <w:p>
+      <w:pPr>
+        <w:rPr>
+          <w:lang w:val="en-IN"/>
+        </w:rPr>
+      </w:pPr>
     </w:p>
     <w:p>
       <w:pPr>
@@ -1154,20 +1539,616 @@
         </w:rPr>
         <w:br/>
       </w:r>
-      <w:r>
-        <w:rPr>
-          <w:lang w:val="en-IN"/>
-        </w:rPr>
-        <w:br/>
-      </w:r>
-      <w:r>
-        <w:rPr>
-          <w:lang w:val="en-IN"/>
-        </w:rPr>
-        <w:t>test forward proxy with curl</w:t>
-      </w:r>
-      <w:r>
-        <w:rPr>
+    </w:p>
+    <w:p>
+      <w:pPr>
+        <w:pStyle w:val="NoSpacing"/>
+        <w:rPr>
+          <w:lang w:val="en-IN"/>
+        </w:rPr>
+      </w:pPr>
+      <w:r>
+        <w:rPr>
+          <w:lang w:val="en-IN"/>
+        </w:rPr>
+        <w:t>a2enmod proxy</w:t>
+      </w:r>
+    </w:p>
+    <w:p>
+      <w:pPr>
+        <w:pStyle w:val="NoSpacing"/>
+        <w:rPr>
+          <w:lang w:val="en-IN"/>
+        </w:rPr>
+      </w:pPr>
+      <w:r>
+        <w:rPr>
+          <w:lang w:val="en-IN"/>
+        </w:rPr>
+        <w:t>Enables Apache’s main proxy module.</w:t>
+      </w:r>
+    </w:p>
+    <w:p>
+      <w:pPr>
+        <w:pStyle w:val="NoSpacing"/>
+        <w:rPr>
+          <w:lang w:val="en-IN"/>
+        </w:rPr>
+      </w:pPr>
+      <w:r>
+        <w:rPr>
+          <w:lang w:val="en-IN"/>
+        </w:rPr>
+        <w:t xml:space="preserve">a2enmod </w:t>
+      </w:r>
+      <w:proofErr w:type="spellStart"/>
+      <w:r>
+        <w:rPr>
+          <w:lang w:val="en-IN"/>
+        </w:rPr>
+        <w:t>proxy_http</w:t>
+      </w:r>
+      <w:proofErr w:type="spellEnd"/>
+    </w:p>
+    <w:p>
+      <w:pPr>
+        <w:pStyle w:val="NoSpacing"/>
+        <w:rPr>
+          <w:lang w:val="en-IN"/>
+        </w:rPr>
+      </w:pPr>
+      <w:r>
+        <w:rPr>
+          <w:lang w:val="en-IN"/>
+        </w:rPr>
+        <w:t>Enables forwarding of normal HTTP requests.</w:t>
+      </w:r>
+    </w:p>
+    <w:p>
+      <w:pPr>
+        <w:pStyle w:val="NoSpacing"/>
+        <w:rPr>
+          <w:lang w:val="en-IN"/>
+        </w:rPr>
+      </w:pPr>
+      <w:r>
+        <w:rPr>
+          <w:lang w:val="en-IN"/>
+        </w:rPr>
+        <w:br/>
+        <w:t>Config</w:t>
+      </w:r>
+      <w:r>
+        <w:rPr>
+          <w:lang w:val="en-IN"/>
+        </w:rPr>
+        <w:br/>
+      </w:r>
+      <w:r>
+        <w:rPr>
+          <w:lang w:val="en-IN"/>
+        </w:rPr>
+        <w:t>&lt;</w:t>
+      </w:r>
+      <w:proofErr w:type="spellStart"/>
+      <w:r>
+        <w:rPr>
+          <w:lang w:val="en-IN"/>
+        </w:rPr>
+        <w:t>VirtualHost</w:t>
+      </w:r>
+      <w:proofErr w:type="spellEnd"/>
+      <w:r>
+        <w:rPr>
+          <w:lang w:val="en-IN"/>
+        </w:rPr>
+        <w:t xml:space="preserve"> 127.0.0.1:3128&gt; </w:t>
+      </w:r>
+      <w:proofErr w:type="spellStart"/>
+      <w:r>
+        <w:rPr>
+          <w:lang w:val="en-IN"/>
+        </w:rPr>
+        <w:t>ServerName</w:t>
+      </w:r>
+      <w:proofErr w:type="spellEnd"/>
+      <w:r>
+        <w:rPr>
+          <w:lang w:val="en-IN"/>
+        </w:rPr>
+        <w:t xml:space="preserve"> localhost </w:t>
+      </w:r>
+      <w:proofErr w:type="spellStart"/>
+      <w:r>
+        <w:rPr>
+          <w:lang w:val="en-IN"/>
+        </w:rPr>
+        <w:t>ProxyRequests</w:t>
+      </w:r>
+      <w:proofErr w:type="spellEnd"/>
+      <w:r>
+        <w:rPr>
+          <w:lang w:val="en-IN"/>
+        </w:rPr>
+        <w:t xml:space="preserve"> On </w:t>
+      </w:r>
+      <w:proofErr w:type="spellStart"/>
+      <w:r>
+        <w:rPr>
+          <w:lang w:val="en-IN"/>
+        </w:rPr>
+        <w:t>ProxyVia</w:t>
+      </w:r>
+      <w:proofErr w:type="spellEnd"/>
+      <w:r>
+        <w:rPr>
+          <w:lang w:val="en-IN"/>
+        </w:rPr>
+        <w:t xml:space="preserve"> On &lt;Proxy "*"&gt; Require local &lt;/Proxy&gt; &lt;/</w:t>
+      </w:r>
+      <w:proofErr w:type="spellStart"/>
+      <w:r>
+        <w:rPr>
+          <w:lang w:val="en-IN"/>
+        </w:rPr>
+        <w:t>VirtualHost</w:t>
+      </w:r>
+      <w:proofErr w:type="spellEnd"/>
+      <w:r>
+        <w:rPr>
+          <w:lang w:val="en-IN"/>
+        </w:rPr>
+        <w:t>&gt;</w:t>
+      </w:r>
+      <w:r>
+        <w:rPr>
+          <w:lang w:val="en-IN"/>
+        </w:rPr>
+        <w:br/>
+      </w:r>
+      <w:r>
+        <w:rPr>
+          <w:lang w:val="en-IN"/>
+        </w:rPr>
+        <w:br/>
+      </w:r>
+      <w:r>
+        <w:rPr>
+          <w:lang w:val="en-IN"/>
+        </w:rPr>
+        <w:t>&lt;</w:t>
+      </w:r>
+      <w:proofErr w:type="spellStart"/>
+      <w:r>
+        <w:rPr>
+          <w:lang w:val="en-IN"/>
+        </w:rPr>
+        <w:t>VirtualHost</w:t>
+      </w:r>
+      <w:proofErr w:type="spellEnd"/>
+      <w:r>
+        <w:rPr>
+          <w:lang w:val="en-IN"/>
+        </w:rPr>
+        <w:t xml:space="preserve"> 127.0.0.1:3128&gt;</w:t>
+      </w:r>
+    </w:p>
+    <w:p>
+      <w:pPr>
+        <w:pStyle w:val="NoSpacing"/>
+        <w:ind w:firstLine="720"/>
+        <w:rPr>
+          <w:lang w:val="en-IN"/>
+        </w:rPr>
+      </w:pPr>
+      <w:r>
+        <w:rPr>
+          <w:lang w:val="en-IN"/>
+        </w:rPr>
+        <w:t>Defines a virtual server listening on local port 3128.</w:t>
+      </w:r>
+    </w:p>
+    <w:p>
+      <w:pPr>
+        <w:pStyle w:val="NoSpacing"/>
+        <w:rPr>
+          <w:lang w:val="en-IN"/>
+        </w:rPr>
+      </w:pPr>
+      <w:proofErr w:type="spellStart"/>
+      <w:r>
+        <w:rPr>
+          <w:lang w:val="en-IN"/>
+        </w:rPr>
+        <w:t>ServerName</w:t>
+      </w:r>
+      <w:proofErr w:type="spellEnd"/>
+      <w:r>
+        <w:rPr>
+          <w:lang w:val="en-IN"/>
+        </w:rPr>
+        <w:t xml:space="preserve"> localhost</w:t>
+      </w:r>
+    </w:p>
+    <w:p>
+      <w:pPr>
+        <w:pStyle w:val="NoSpacing"/>
+        <w:ind w:firstLine="720"/>
+        <w:rPr>
+          <w:lang w:val="en-IN"/>
+        </w:rPr>
+      </w:pPr>
+      <w:r>
+        <w:rPr>
+          <w:lang w:val="en-IN"/>
+        </w:rPr>
+        <w:t>Names the Apache server localhost.</w:t>
+      </w:r>
+    </w:p>
+    <w:p>
+      <w:pPr>
+        <w:pStyle w:val="NoSpacing"/>
+        <w:rPr>
+          <w:lang w:val="en-IN"/>
+        </w:rPr>
+      </w:pPr>
+      <w:proofErr w:type="spellStart"/>
+      <w:r>
+        <w:rPr>
+          <w:lang w:val="en-IN"/>
+        </w:rPr>
+        <w:t>ProxyRequests</w:t>
+      </w:r>
+      <w:proofErr w:type="spellEnd"/>
+      <w:r>
+        <w:rPr>
+          <w:lang w:val="en-IN"/>
+        </w:rPr>
+        <w:t xml:space="preserve"> On</w:t>
+      </w:r>
+    </w:p>
+    <w:p>
+      <w:pPr>
+        <w:pStyle w:val="NoSpacing"/>
+        <w:ind w:firstLine="720"/>
+        <w:rPr>
+          <w:lang w:val="en-IN"/>
+        </w:rPr>
+      </w:pPr>
+      <w:r>
+        <w:rPr>
+          <w:lang w:val="en-IN"/>
+        </w:rPr>
+        <w:t>Enables forward proxy mode.</w:t>
+      </w:r>
+    </w:p>
+    <w:p>
+      <w:pPr>
+        <w:pStyle w:val="NoSpacing"/>
+        <w:rPr>
+          <w:lang w:val="en-IN"/>
+        </w:rPr>
+      </w:pPr>
+      <w:proofErr w:type="spellStart"/>
+      <w:r>
+        <w:rPr>
+          <w:lang w:val="en-IN"/>
+        </w:rPr>
+        <w:t>ProxyVia</w:t>
+      </w:r>
+      <w:proofErr w:type="spellEnd"/>
+      <w:r>
+        <w:rPr>
+          <w:lang w:val="en-IN"/>
+        </w:rPr>
+        <w:t xml:space="preserve"> On</w:t>
+      </w:r>
+    </w:p>
+    <w:p>
+      <w:pPr>
+        <w:pStyle w:val="NoSpacing"/>
+        <w:ind w:firstLine="720"/>
+        <w:rPr>
+          <w:lang w:val="en-IN"/>
+        </w:rPr>
+      </w:pPr>
+      <w:r>
+        <w:rPr>
+          <w:lang w:val="en-IN"/>
+        </w:rPr>
+        <w:t>Adds proxy information to forwarded HTTP responses.</w:t>
+      </w:r>
+    </w:p>
+    <w:p>
+      <w:pPr>
+        <w:pStyle w:val="NoSpacing"/>
+        <w:rPr>
+          <w:lang w:val="en-IN"/>
+        </w:rPr>
+      </w:pPr>
+      <w:r>
+        <w:rPr>
+          <w:lang w:val="en-IN"/>
+        </w:rPr>
+        <w:t>&lt;Proxy "*"&gt;</w:t>
+      </w:r>
+    </w:p>
+    <w:p>
+      <w:pPr>
+        <w:pStyle w:val="NoSpacing"/>
+        <w:ind w:firstLine="720"/>
+        <w:rPr>
+          <w:lang w:val="en-IN"/>
+        </w:rPr>
+      </w:pPr>
+      <w:r>
+        <w:rPr>
+          <w:lang w:val="en-IN"/>
+        </w:rPr>
+        <w:t xml:space="preserve">Applies the following access rule to all proxy </w:t>
+      </w:r>
+      <w:proofErr w:type="spellStart"/>
+      <w:proofErr w:type="gramStart"/>
+      <w:r>
+        <w:rPr>
+          <w:lang w:val="en-IN"/>
+        </w:rPr>
+        <w:t>destinations.The</w:t>
+      </w:r>
+      <w:proofErr w:type="spellEnd"/>
+      <w:proofErr w:type="gramEnd"/>
+      <w:r>
+        <w:rPr>
+          <w:lang w:val="en-IN"/>
+        </w:rPr>
+        <w:t xml:space="preserve"> * means all destinations.</w:t>
+      </w:r>
+    </w:p>
+    <w:p>
+      <w:pPr>
+        <w:pStyle w:val="NoSpacing"/>
+        <w:rPr>
+          <w:lang w:val="en-IN"/>
+        </w:rPr>
+      </w:pPr>
+      <w:r>
+        <w:rPr>
+          <w:lang w:val="en-IN"/>
+        </w:rPr>
+        <w:t>Require local</w:t>
+      </w:r>
+    </w:p>
+    <w:p>
+      <w:pPr>
+        <w:pStyle w:val="NoSpacing"/>
+        <w:ind w:firstLine="720"/>
+        <w:rPr>
+          <w:lang w:val="en-IN"/>
+        </w:rPr>
+      </w:pPr>
+      <w:r>
+        <w:rPr>
+          <w:lang w:val="en-IN"/>
+        </w:rPr>
+        <w:t>Allows only local clients to use the proxy.</w:t>
+      </w:r>
+      <w:r>
+        <w:rPr>
+          <w:lang w:val="en-IN"/>
+        </w:rPr>
+        <w:br/>
+      </w:r>
+    </w:p>
+    <w:p>
+      <w:pPr>
+        <w:pStyle w:val="NoSpacing"/>
+        <w:rPr>
+          <w:lang w:val="en-IN"/>
+        </w:rPr>
+      </w:pPr>
+      <w:r>
+        <w:rPr>
+          <w:lang w:val="en-IN"/>
+        </w:rPr>
+        <w:t>a2dissite 000-default.conf</w:t>
+      </w:r>
+    </w:p>
+    <w:p>
+      <w:pPr>
+        <w:pStyle w:val="NoSpacing"/>
+        <w:ind w:firstLine="720"/>
+        <w:rPr>
+          <w:lang w:val="en-IN"/>
+        </w:rPr>
+      </w:pPr>
+      <w:r>
+        <w:rPr>
+          <w:lang w:val="en-IN"/>
+        </w:rPr>
+        <w:t>Disables Apache’s default website.</w:t>
+      </w:r>
+    </w:p>
+    <w:p>
+      <w:pPr>
+        <w:pStyle w:val="NoSpacing"/>
+        <w:rPr>
+          <w:lang w:val="en-IN"/>
+        </w:rPr>
+      </w:pPr>
+      <w:r>
+        <w:rPr>
+          <w:lang w:val="en-IN"/>
+        </w:rPr>
+        <w:t>a2ensite forward-</w:t>
+      </w:r>
+      <w:proofErr w:type="spellStart"/>
+      <w:r>
+        <w:rPr>
+          <w:lang w:val="en-IN"/>
+        </w:rPr>
+        <w:t>proxy.conf</w:t>
+      </w:r>
+      <w:proofErr w:type="spellEnd"/>
+    </w:p>
+    <w:p>
+      <w:pPr>
+        <w:pStyle w:val="NoSpacing"/>
+        <w:ind w:firstLine="720"/>
+        <w:rPr>
+          <w:lang w:val="en-IN"/>
+        </w:rPr>
+      </w:pPr>
+      <w:r>
+        <w:rPr>
+          <w:lang w:val="en-IN"/>
+        </w:rPr>
+        <w:t>Enables our forward-proxy configuration.</w:t>
+      </w:r>
+    </w:p>
+    <w:p>
+      <w:pPr>
+        <w:pStyle w:val="NoSpacing"/>
+        <w:rPr>
+          <w:lang w:val="en-IN"/>
+        </w:rPr>
+      </w:pPr>
+      <w:proofErr w:type="spellStart"/>
+      <w:r>
+        <w:rPr>
+          <w:lang w:val="en-IN"/>
+        </w:rPr>
+        <w:t>apachectl</w:t>
+      </w:r>
+      <w:proofErr w:type="spellEnd"/>
+      <w:r>
+        <w:rPr>
+          <w:lang w:val="en-IN"/>
+        </w:rPr>
+        <w:t xml:space="preserve"> </w:t>
+      </w:r>
+      <w:proofErr w:type="spellStart"/>
+      <w:r>
+        <w:rPr>
+          <w:lang w:val="en-IN"/>
+        </w:rPr>
+        <w:t>configtest</w:t>
+      </w:r>
+      <w:proofErr w:type="spellEnd"/>
+    </w:p>
+    <w:p>
+      <w:pPr>
+        <w:pStyle w:val="NoSpacing"/>
+        <w:rPr>
+          <w:lang w:val="en-IN"/>
+        </w:rPr>
+      </w:pPr>
+      <w:r>
+        <w:rPr>
+          <w:lang w:val="en-IN"/>
+        </w:rPr>
+        <w:t>service apache2 restart</w:t>
+      </w:r>
+    </w:p>
+    <w:p>
+      <w:pPr>
+        <w:pStyle w:val="NoSpacing"/>
+        <w:ind w:firstLine="720"/>
+        <w:rPr>
+          <w:lang w:val="en-IN"/>
+        </w:rPr>
+      </w:pPr>
+      <w:r>
+        <w:rPr>
+          <w:lang w:val="en-IN"/>
+        </w:rPr>
+        <w:lastRenderedPageBreak/>
+        <w:t>Restarts Apache using the new configuration.</w:t>
+      </w:r>
+      <w:r>
+        <w:rPr>
+          <w:lang w:val="en-IN"/>
+        </w:rPr>
+        <w:br/>
+      </w:r>
+      <w:r>
+        <w:rPr>
+          <w:lang w:val="en-IN"/>
+        </w:rPr>
+        <w:br/>
+      </w:r>
+      <w:r>
+        <w:rPr>
+          <w:lang w:val="en-IN"/>
+        </w:rPr>
+        <w:t>Check that all services are listening</w:t>
+      </w:r>
+    </w:p>
+    <w:p>
+      <w:pPr>
+        <w:pStyle w:val="NoSpacing"/>
+        <w:ind w:firstLine="720"/>
+        <w:rPr>
+          <w:lang w:val="en-IN"/>
+        </w:rPr>
+      </w:pPr>
+      <w:r>
+        <w:rPr>
+          <w:lang w:val="en-IN"/>
+        </w:rPr>
+        <w:t>ss -</w:t>
+      </w:r>
+      <w:proofErr w:type="spellStart"/>
+      <w:r>
+        <w:rPr>
+          <w:lang w:val="en-IN"/>
+        </w:rPr>
+        <w:t>ltn</w:t>
+      </w:r>
+      <w:proofErr w:type="spellEnd"/>
+    </w:p>
+    <w:p>
+      <w:pPr>
+        <w:pStyle w:val="NoSpacing"/>
+        <w:ind w:firstLine="720"/>
+        <w:rPr>
+          <w:lang w:val="en-IN"/>
+        </w:rPr>
+      </w:pPr>
+    </w:p>
+    <w:p>
+      <w:pPr>
+        <w:pStyle w:val="NoSpacing"/>
+        <w:ind w:firstLine="720"/>
+        <w:rPr>
+          <w:lang w:val="en-IN"/>
+        </w:rPr>
+      </w:pPr>
+      <w:r>
+        <w:rPr>
+          <w:lang w:val="en-IN"/>
+        </w:rPr>
+        <w:br/>
+      </w:r>
+      <w:r>
+        <w:rPr>
+          <w:b/>
+          <w:bCs/>
+          <w:lang w:val="en-IN"/>
+        </w:rPr>
+        <w:t>T</w:t>
+      </w:r>
+      <w:r>
+        <w:rPr>
+          <w:b/>
+          <w:bCs/>
+          <w:lang w:val="en-IN"/>
+        </w:rPr>
+        <w:t>est forward proxy with curl</w:t>
+      </w:r>
+      <w:r>
+        <w:rPr>
+          <w:b/>
+          <w:bCs/>
           <w:lang w:val="en-IN"/>
         </w:rPr>
         <w:br/>
@@ -1236,10 +2217,310 @@
         </w:rPr>
         <w:br/>
       </w:r>
+      <w:r>
+        <w:rPr>
+          <w:lang w:val="en-IN"/>
+        </w:rPr>
+        <w:br/>
+      </w:r>
+      <w:r>
+        <w:rPr>
+          <w:lang w:val="en-IN"/>
+        </w:rPr>
+        <w:br/>
+      </w:r>
+      <w:r>
+        <w:rPr>
+          <w:lang w:val="en-IN"/>
+        </w:rPr>
+        <w:br/>
+      </w:r>
+      <w:r>
+        <w:rPr>
+          <w:b/>
+          <w:bCs/>
+          <w:sz w:val="32"/>
+          <w:szCs w:val="32"/>
+          <w:lang w:val="en-IN"/>
+        </w:rPr>
+        <w:t>3. Network Analysis</w:t>
+      </w:r>
+      <w:r>
+        <w:rPr>
+          <w:b/>
+          <w:bCs/>
+          <w:sz w:val="32"/>
+          <w:szCs w:val="32"/>
+          <w:lang w:val="en-IN"/>
+        </w:rPr>
+        <w:br/>
+      </w:r>
+      <w:proofErr w:type="spellStart"/>
+      <w:r>
+        <w:rPr>
+          <w:lang w:val="en-IN"/>
+        </w:rPr>
+        <w:t>i</w:t>
+      </w:r>
+      <w:proofErr w:type="spellEnd"/>
+      <w:r>
+        <w:rPr>
+          <w:lang w:val="en-IN"/>
+        </w:rPr>
+        <w:t xml:space="preserve">) What methods can be used to capture only HTTP traffic on a specific port for detailed inspection </w:t>
+      </w:r>
+    </w:p>
+    <w:p>
+      <w:pPr>
+        <w:pStyle w:val="NoSpacing"/>
+        <w:ind w:firstLine="720"/>
+        <w:rPr>
+          <w:lang w:val="en-IN"/>
+        </w:rPr>
+      </w:pPr>
+      <w:r>
+        <w:rPr>
+          <w:lang w:val="en-IN"/>
+        </w:rPr>
+        <w:t>of requests and responses?</w:t>
+      </w:r>
+    </w:p>
+    <w:p>
+      <w:pPr>
+        <w:pStyle w:val="NoSpacing"/>
+        <w:ind w:firstLine="720"/>
+        <w:rPr>
+          <w:lang w:val="en-IN"/>
+        </w:rPr>
+      </w:pPr>
+      <w:proofErr w:type="spellStart"/>
+      <w:proofErr w:type="gramStart"/>
+      <w:r>
+        <w:rPr>
+          <w:lang w:val="en-IN"/>
+        </w:rPr>
+        <w:t>tcpdump</w:t>
+      </w:r>
+      <w:proofErr w:type="spellEnd"/>
+      <w:r>
+        <w:rPr>
+          <w:lang w:val="en-IN"/>
+        </w:rPr>
+        <w:t xml:space="preserve">  '</w:t>
+      </w:r>
+      <w:proofErr w:type="spellStart"/>
+      <w:proofErr w:type="gramEnd"/>
+      <w:r>
+        <w:rPr>
+          <w:lang w:val="en-IN"/>
+        </w:rPr>
+        <w:t>tcp</w:t>
+      </w:r>
+      <w:proofErr w:type="spellEnd"/>
+      <w:r>
+        <w:rPr>
+          <w:lang w:val="en-IN"/>
+        </w:rPr>
+        <w:t xml:space="preserve"> port 8080'</w:t>
+      </w:r>
+    </w:p>
+    <w:p>
+      <w:pPr>
+        <w:pStyle w:val="NoSpacing"/>
+        <w:rPr>
+          <w:lang w:val="en-IN"/>
+        </w:rPr>
+      </w:pPr>
+      <w:r>
+        <w:rPr>
+          <w:lang w:val="en-IN"/>
+        </w:rPr>
+        <w:br/>
+      </w:r>
+      <w:r>
+        <w:rPr>
+          <w:lang w:val="en-IN"/>
+        </w:rPr>
+        <w:br/>
+      </w:r>
+      <w:r>
+        <w:rPr>
+          <w:lang w:val="en-IN"/>
+        </w:rPr>
+        <w:drawing>
+          <wp:inline distT="0" distB="0" distL="0" distR="0" wp14:anchorId="276DBBFF" wp14:editId="2B170209">
+            <wp:extent cx="6858000" cy="670560"/>
+            <wp:effectExtent l="0" t="0" r="0" b="0"/>
+            <wp:docPr id="1974934910" name="Picture 1"/>
+            <wp:cNvGraphicFramePr>
+              <a:graphicFrameLocks xmlns:a="http://schemas.openxmlformats.org/drawingml/2006/main" noChangeAspect="1"/>
+            </wp:cNvGraphicFramePr>
+            <a:graphic xmlns:a="http://schemas.openxmlformats.org/drawingml/2006/main">
+              <a:graphicData uri="http://schemas.openxmlformats.org/drawingml/2006/picture">
+                <pic:pic xmlns:pic="http://schemas.openxmlformats.org/drawingml/2006/picture">
+                  <pic:nvPicPr>
+                    <pic:cNvPr id="1974934910" name=""/>
+                    <pic:cNvPicPr/>
+                  </pic:nvPicPr>
+                  <pic:blipFill>
+                    <a:blip r:embed="rId15"/>
+                    <a:stretch>
+                      <a:fillRect/>
+                    </a:stretch>
+                  </pic:blipFill>
+                  <pic:spPr>
+                    <a:xfrm>
+                      <a:off x="0" y="0"/>
+                      <a:ext cx="6858000" cy="670560"/>
+                    </a:xfrm>
+                    <a:prstGeom prst="rect">
+                      <a:avLst/>
+                    </a:prstGeom>
+                  </pic:spPr>
+                </pic:pic>
+              </a:graphicData>
+            </a:graphic>
+          </wp:inline>
+        </w:drawing>
+      </w:r>
+      <w:r>
+        <w:rPr>
+          <w:lang w:val="en-IN"/>
+        </w:rPr>
+        <w:br/>
+      </w:r>
+      <w:r>
+        <w:rPr>
+          <w:lang w:val="en-IN"/>
+        </w:rPr>
+        <w:br/>
+        <w:t xml:space="preserve">replicate </w:t>
+      </w:r>
+      <w:proofErr w:type="gramStart"/>
+      <w:r>
+        <w:rPr>
+          <w:lang w:val="en-IN"/>
+        </w:rPr>
+        <w:t>a</w:t>
+      </w:r>
+      <w:proofErr w:type="gramEnd"/>
+      <w:r>
+        <w:rPr>
+          <w:lang w:val="en-IN"/>
+        </w:rPr>
+        <w:t xml:space="preserve"> </w:t>
+      </w:r>
+      <w:proofErr w:type="spellStart"/>
+      <w:r>
+        <w:rPr>
+          <w:lang w:val="en-IN"/>
+        </w:rPr>
+        <w:t>api</w:t>
+      </w:r>
+      <w:proofErr w:type="spellEnd"/>
+      <w:r>
+        <w:rPr>
+          <w:lang w:val="en-IN"/>
+        </w:rPr>
+        <w:t xml:space="preserve"> call</w:t>
+      </w:r>
+      <w:r>
+        <w:rPr>
+          <w:lang w:val="en-IN"/>
+        </w:rPr>
+        <w:br/>
+      </w:r>
+      <w:r>
+        <w:rPr>
+          <w:lang w:val="en-IN"/>
+        </w:rPr>
+        <w:drawing>
+          <wp:inline distT="0" distB="0" distL="0" distR="0" wp14:anchorId="445C6513" wp14:editId="76A5BB86">
+            <wp:extent cx="3669030" cy="1630777"/>
+            <wp:effectExtent l="0" t="0" r="7620" b="7620"/>
+            <wp:docPr id="1923865685" name="Picture 1"/>
+            <wp:cNvGraphicFramePr>
+              <a:graphicFrameLocks xmlns:a="http://schemas.openxmlformats.org/drawingml/2006/main" noChangeAspect="1"/>
+            </wp:cNvGraphicFramePr>
+            <a:graphic xmlns:a="http://schemas.openxmlformats.org/drawingml/2006/main">
+              <a:graphicData uri="http://schemas.openxmlformats.org/drawingml/2006/picture">
+                <pic:pic xmlns:pic="http://schemas.openxmlformats.org/drawingml/2006/picture">
+                  <pic:nvPicPr>
+                    <pic:cNvPr id="1923865685" name=""/>
+                    <pic:cNvPicPr/>
+                  </pic:nvPicPr>
+                  <pic:blipFill>
+                    <a:blip r:embed="rId16"/>
+                    <a:stretch>
+                      <a:fillRect/>
+                    </a:stretch>
+                  </pic:blipFill>
+                  <pic:spPr>
+                    <a:xfrm>
+                      <a:off x="0" y="0"/>
+                      <a:ext cx="3681788" cy="1636447"/>
+                    </a:xfrm>
+                    <a:prstGeom prst="rect">
+                      <a:avLst/>
+                    </a:prstGeom>
+                  </pic:spPr>
+                </pic:pic>
+              </a:graphicData>
+            </a:graphic>
+          </wp:inline>
+        </w:drawing>
+      </w:r>
+      <w:r>
+        <w:rPr>
+          <w:lang w:val="en-IN"/>
+        </w:rPr>
+        <w:br/>
+      </w:r>
+      <w:r>
+        <w:rPr>
+          <w:lang w:val="en-IN"/>
+        </w:rPr>
+        <w:br/>
+      </w:r>
+      <w:r>
+        <w:rPr>
+          <w:lang w:val="en-IN"/>
+        </w:rPr>
+        <w:lastRenderedPageBreak/>
+        <w:br/>
+      </w:r>
+      <w:r>
+        <w:rPr>
+          <w:lang w:val="en-IN"/>
+        </w:rPr>
+        <w:t xml:space="preserve">ii) How can one isolate and interpret different HTTP methods and status codes from a larger </w:t>
+      </w:r>
+    </w:p>
+    <w:p>
+      <w:pPr>
+        <w:pStyle w:val="NoSpacing"/>
+        <w:rPr>
+          <w:lang w:val="en-IN"/>
+        </w:rPr>
+      </w:pPr>
+      <w:r>
+        <w:rPr>
+          <w:lang w:val="en-IN"/>
+        </w:rPr>
+        <w:t>volume of captured traffic?</w:t>
+      </w:r>
+    </w:p>
+    <w:p>
+      <w:pPr>
+        <w:pStyle w:val="NoSpacing"/>
+        <w:rPr>
+          <w:lang w:val="en-IN"/>
+        </w:rPr>
+      </w:pPr>
     </w:p>
     <w:sectPr>
       <w:pgSz w:w="12240" w:h="15840"/>
-      <w:pgMar w:top="1440" w:right="1440" w:bottom="1440" w:left="1440" w:header="720" w:footer="720" w:gutter="0"/>
+      <w:pgMar w:top="720" w:right="720" w:bottom="720" w:left="720" w:header="720" w:footer="720" w:gutter="0"/>
       <w:cols w:space="720"/>
       <w:docGrid w:linePitch="360"/>
     </w:sectPr>
@@ -2331,6 +3612,15 @@
       <w:rFonts w:ascii="Times New Roman" w:hAnsi="Times New Roman" w:cs="Times New Roman"/>
     </w:rPr>
   </w:style>
+  <w:style w:type="paragraph" w:styleId="NoSpacing">
+    <w:name w:val="No Spacing"/>
+    <w:uiPriority w:val="1"/>
+    <w:qFormat/>
+    <w:rsid w:val="00851BA2"/>
+    <w:pPr>
+      <w:spacing w:after="0" w:line="240" w:lineRule="auto"/>
+    </w:pPr>
+  </w:style>
 </w:styles>
 </file>
 

</xml_diff>

<commit_message>
cloud assignment question 1 done
</commit_message>
<xml_diff>
--- a/Networking_Assignment.docx
+++ b/Networking_Assignment.docx
@@ -355,7 +355,6 @@
           <w:lang w:val="en-IN"/>
         </w:rPr>
       </w:pPr>
-      <w:proofErr w:type="gramStart"/>
       <w:r>
         <w:rPr>
           <w:lang w:val="en-IN"/>
@@ -372,14 +371,7 @@
         <w:rPr>
           <w:lang w:val="en-IN"/>
         </w:rPr>
-        <w:t xml:space="preserve"> Domain</w:t>
-      </w:r>
-      <w:proofErr w:type="gramEnd"/>
-      <w:r>
-        <w:rPr>
-          <w:lang w:val="en-IN"/>
-        </w:rPr>
-        <w:t xml:space="preserve"> being resolved</w:t>
+        <w:t xml:space="preserve"> Domain being resolved</w:t>
       </w:r>
       <w:r>
         <w:rPr>
@@ -764,21 +756,7 @@
         <w:rPr>
           <w:lang w:val="en-IN"/>
         </w:rPr>
-        <w:t xml:space="preserve">The </w:t>
-      </w:r>
-      <w:proofErr w:type="gramStart"/>
-      <w:r>
-        <w:rPr>
-          <w:lang w:val="en-IN"/>
-        </w:rPr>
-        <w:t>hosts</w:t>
-      </w:r>
-      <w:proofErr w:type="gramEnd"/>
-      <w:r>
-        <w:rPr>
-          <w:lang w:val="en-IN"/>
-        </w:rPr>
-        <w:t xml:space="preserve"> file is checked before external DNS servers.</w:t>
+        <w:t>The hosts file is checked before external DNS servers.</w:t>
       </w:r>
       <w:r>
         <w:rPr>
@@ -1063,7 +1041,6 @@
         <w:t xml:space="preserve">python3 -m </w:t>
       </w:r>
       <w:proofErr w:type="spellStart"/>
-      <w:proofErr w:type="gramStart"/>
       <w:r>
         <w:rPr>
           <w:lang w:val="en-IN"/>
@@ -1071,7 +1048,6 @@
         <w:t>http.server</w:t>
       </w:r>
       <w:proofErr w:type="spellEnd"/>
-      <w:proofErr w:type="gramEnd"/>
       <w:r>
         <w:rPr>
           <w:lang w:val="en-IN"/>
@@ -1888,7 +1864,6 @@
         <w:t xml:space="preserve">Applies the following access rule to all proxy </w:t>
       </w:r>
       <w:proofErr w:type="spellStart"/>
-      <w:proofErr w:type="gramStart"/>
       <w:r>
         <w:rPr>
           <w:lang w:val="en-IN"/>
@@ -1896,7 +1871,6 @@
         <w:t>destinations.The</w:t>
       </w:r>
       <w:proofErr w:type="spellEnd"/>
-      <w:proofErr w:type="gramEnd"/>
       <w:r>
         <w:rPr>
           <w:lang w:val="en-IN"/>
@@ -2288,41 +2262,84 @@
     <w:p>
       <w:pPr>
         <w:pStyle w:val="NoSpacing"/>
+        <w:rPr>
+          <w:lang w:val="en-IN"/>
+        </w:rPr>
+      </w:pPr>
+      <w:proofErr w:type="spellStart"/>
+      <w:r>
+        <w:rPr>
+          <w:lang w:val="en-IN"/>
+        </w:rPr>
+        <w:t>tcpdump</w:t>
+      </w:r>
+      <w:proofErr w:type="spellEnd"/>
+      <w:r>
+        <w:rPr>
+          <w:lang w:val="en-IN"/>
+        </w:rPr>
+        <w:t xml:space="preserve">  '</w:t>
+      </w:r>
+      <w:proofErr w:type="spellStart"/>
+      <w:r>
+        <w:rPr>
+          <w:lang w:val="en-IN"/>
+        </w:rPr>
+        <w:t>tcp</w:t>
+      </w:r>
+      <w:proofErr w:type="spellEnd"/>
+      <w:r>
+        <w:rPr>
+          <w:lang w:val="en-IN"/>
+        </w:rPr>
+        <w:t xml:space="preserve"> port 8080'</w:t>
+      </w:r>
+    </w:p>
+    <w:p>
+      <w:pPr>
+        <w:pStyle w:val="NoSpacing"/>
+        <w:rPr>
+          <w:lang w:val="en-IN"/>
+        </w:rPr>
+      </w:pPr>
+      <w:proofErr w:type="spellStart"/>
+      <w:r>
+        <w:rPr>
+          <w:lang w:val="en-IN"/>
+        </w:rPr>
+        <w:t>tcpdump</w:t>
+      </w:r>
+      <w:proofErr w:type="spellEnd"/>
+      <w:r>
+        <w:rPr>
+          <w:lang w:val="en-IN"/>
+        </w:rPr>
+        <w:t xml:space="preserve"> -n 'port 8080'</w:t>
+      </w:r>
+      <w:r>
+        <w:rPr>
+          <w:lang w:val="en-IN"/>
+        </w:rPr>
+        <w:t xml:space="preserve">  -&gt;</w:t>
+      </w:r>
+      <w:r>
+        <w:t xml:space="preserve"> </w:t>
+      </w:r>
+      <w:r>
+        <w:rPr>
+          <w:lang w:val="en-IN"/>
+        </w:rPr>
+        <w:t>TCP or UDP</w:t>
+      </w:r>
+    </w:p>
+    <w:p>
+      <w:pPr>
+        <w:pStyle w:val="NoSpacing"/>
         <w:ind w:firstLine="720"/>
         <w:rPr>
           <w:lang w:val="en-IN"/>
         </w:rPr>
       </w:pPr>
-      <w:proofErr w:type="spellStart"/>
-      <w:proofErr w:type="gramStart"/>
-      <w:r>
-        <w:rPr>
-          <w:lang w:val="en-IN"/>
-        </w:rPr>
-        <w:t>tcpdump</w:t>
-      </w:r>
-      <w:proofErr w:type="spellEnd"/>
-      <w:r>
-        <w:rPr>
-          <w:lang w:val="en-IN"/>
-        </w:rPr>
-        <w:t xml:space="preserve">  '</w:t>
-      </w:r>
-      <w:proofErr w:type="spellStart"/>
-      <w:proofErr w:type="gramEnd"/>
-      <w:r>
-        <w:rPr>
-          <w:lang w:val="en-IN"/>
-        </w:rPr>
-        <w:t>tcp</w:t>
-      </w:r>
-      <w:proofErr w:type="spellEnd"/>
-      <w:r>
-        <w:rPr>
-          <w:lang w:val="en-IN"/>
-        </w:rPr>
-        <w:t xml:space="preserve"> port 8080'</w:t>
-      </w:r>
     </w:p>
     <w:p>
       <w:pPr>
@@ -2394,21 +2411,7 @@
           <w:lang w:val="en-IN"/>
         </w:rPr>
         <w:br/>
-        <w:t xml:space="preserve">replicate </w:t>
-      </w:r>
-      <w:proofErr w:type="gramStart"/>
-      <w:r>
-        <w:rPr>
-          <w:lang w:val="en-IN"/>
-        </w:rPr>
-        <w:t>a</w:t>
-      </w:r>
-      <w:proofErr w:type="gramEnd"/>
-      <w:r>
-        <w:rPr>
-          <w:lang w:val="en-IN"/>
-        </w:rPr>
-        <w:t xml:space="preserve"> </w:t>
+        <w:t xml:space="preserve">replicate a </w:t>
       </w:r>
       <w:proofErr w:type="spellStart"/>
       <w:r>
@@ -2480,12 +2483,6 @@
         <w:rPr>
           <w:lang w:val="en-IN"/>
         </w:rPr>
-        <w:br/>
-      </w:r>
-      <w:r>
-        <w:rPr>
-          <w:lang w:val="en-IN"/>
-        </w:rPr>
         <w:lastRenderedPageBreak/>
         <w:br/>
       </w:r>
@@ -2493,6 +2490,12 @@
         <w:rPr>
           <w:lang w:val="en-IN"/>
         </w:rPr>
+        <w:br/>
+      </w:r>
+      <w:r>
+        <w:rPr>
+          <w:lang w:val="en-IN"/>
+        </w:rPr>
         <w:t xml:space="preserve">ii) How can one isolate and interpret different HTTP methods and status codes from a larger </w:t>
       </w:r>
     </w:p>
@@ -2509,6 +2512,750 @@
         </w:rPr>
         <w:t>volume of captured traffic?</w:t>
       </w:r>
+    </w:p>
+    <w:p>
+      <w:pPr>
+        <w:pStyle w:val="NoSpacing"/>
+        <w:rPr>
+          <w:lang w:val="en-IN"/>
+        </w:rPr>
+      </w:pPr>
+    </w:p>
+    <w:p>
+      <w:pPr>
+        <w:pStyle w:val="NoSpacing"/>
+        <w:rPr>
+          <w:lang w:val="en-IN"/>
+        </w:rPr>
+      </w:pPr>
+      <w:proofErr w:type="spellStart"/>
+      <w:r>
+        <w:rPr>
+          <w:lang w:val="en-IN"/>
+        </w:rPr>
+        <w:t>tcpdump</w:t>
+      </w:r>
+      <w:proofErr w:type="spellEnd"/>
+      <w:r>
+        <w:rPr>
+          <w:lang w:val="en-IN"/>
+        </w:rPr>
+        <w:t xml:space="preserve"> '</w:t>
+      </w:r>
+      <w:proofErr w:type="spellStart"/>
+      <w:r>
+        <w:rPr>
+          <w:lang w:val="en-IN"/>
+        </w:rPr>
+        <w:t>tcp</w:t>
+      </w:r>
+      <w:proofErr w:type="spellEnd"/>
+      <w:r>
+        <w:rPr>
+          <w:lang w:val="en-IN"/>
+        </w:rPr>
+        <w:t xml:space="preserve"> port 8080' </w:t>
+      </w:r>
+      <w:r>
+        <w:rPr>
+          <w:lang w:val="en-IN"/>
+        </w:rPr>
+        <w:tab/>
+      </w:r>
+      <w:r>
+        <w:rPr>
+          <w:lang w:val="en-IN"/>
+        </w:rPr>
+        <w:tab/>
+      </w:r>
+      <w:r>
+        <w:rPr>
+          <w:lang w:val="en-IN"/>
+        </w:rPr>
+        <w:t xml:space="preserve">Shows all port 8080 traffic </w:t>
+      </w:r>
+      <w:r>
+        <w:rPr>
+          <w:lang w:val="en-IN"/>
+        </w:rPr>
+        <w:br/>
+      </w:r>
+      <w:proofErr w:type="spellStart"/>
+      <w:r>
+        <w:rPr>
+          <w:lang w:val="en-IN"/>
+        </w:rPr>
+        <w:t>tcpdump</w:t>
+      </w:r>
+      <w:proofErr w:type="spellEnd"/>
+      <w:r>
+        <w:rPr>
+          <w:lang w:val="en-IN"/>
+        </w:rPr>
+        <w:t xml:space="preserve"> '</w:t>
+      </w:r>
+      <w:proofErr w:type="spellStart"/>
+      <w:r>
+        <w:rPr>
+          <w:lang w:val="en-IN"/>
+        </w:rPr>
+        <w:t>tcp</w:t>
+      </w:r>
+      <w:proofErr w:type="spellEnd"/>
+      <w:r>
+        <w:rPr>
+          <w:lang w:val="en-IN"/>
+        </w:rPr>
+        <w:t xml:space="preserve"> </w:t>
+      </w:r>
+      <w:proofErr w:type="spellStart"/>
+      <w:r>
+        <w:rPr>
+          <w:lang w:val="en-IN"/>
+        </w:rPr>
+        <w:t>dst</w:t>
+      </w:r>
+      <w:proofErr w:type="spellEnd"/>
+      <w:r>
+        <w:rPr>
+          <w:lang w:val="en-IN"/>
+        </w:rPr>
+        <w:t xml:space="preserve"> port 8080' </w:t>
+      </w:r>
+      <w:r>
+        <w:rPr>
+          <w:lang w:val="en-IN"/>
+        </w:rPr>
+        <w:tab/>
+      </w:r>
+      <w:r>
+        <w:rPr>
+          <w:lang w:val="en-IN"/>
+        </w:rPr>
+        <w:t>Shows client requests</w:t>
+      </w:r>
+      <w:r>
+        <w:rPr>
+          <w:lang w:val="en-IN"/>
+        </w:rPr>
+        <w:br/>
+      </w:r>
+      <w:r>
+        <w:rPr>
+          <w:lang w:val="en-IN"/>
+        </w:rPr>
+        <w:t xml:space="preserve"> </w:t>
+      </w:r>
+      <w:proofErr w:type="spellStart"/>
+      <w:r>
+        <w:rPr>
+          <w:lang w:val="en-IN"/>
+        </w:rPr>
+        <w:t>tcpdump</w:t>
+      </w:r>
+      <w:proofErr w:type="spellEnd"/>
+      <w:r>
+        <w:rPr>
+          <w:lang w:val="en-IN"/>
+        </w:rPr>
+        <w:t xml:space="preserve"> '</w:t>
+      </w:r>
+      <w:proofErr w:type="spellStart"/>
+      <w:r>
+        <w:rPr>
+          <w:lang w:val="en-IN"/>
+        </w:rPr>
+        <w:t>tcp</w:t>
+      </w:r>
+      <w:proofErr w:type="spellEnd"/>
+      <w:r>
+        <w:rPr>
+          <w:lang w:val="en-IN"/>
+        </w:rPr>
+        <w:t xml:space="preserve"> </w:t>
+      </w:r>
+      <w:proofErr w:type="spellStart"/>
+      <w:r>
+        <w:rPr>
+          <w:lang w:val="en-IN"/>
+        </w:rPr>
+        <w:t>src</w:t>
+      </w:r>
+      <w:proofErr w:type="spellEnd"/>
+      <w:r>
+        <w:rPr>
+          <w:lang w:val="en-IN"/>
+        </w:rPr>
+        <w:t xml:space="preserve"> port 8080' </w:t>
+      </w:r>
+      <w:r>
+        <w:rPr>
+          <w:lang w:val="en-IN"/>
+        </w:rPr>
+        <w:tab/>
+      </w:r>
+      <w:r>
+        <w:rPr>
+          <w:lang w:val="en-IN"/>
+        </w:rPr>
+        <w:t>Shows server responses</w:t>
+      </w:r>
+      <w:r>
+        <w:rPr>
+          <w:lang w:val="en-IN"/>
+        </w:rPr>
+        <w:br/>
+      </w:r>
+      <w:proofErr w:type="spellStart"/>
+      <w:r>
+        <w:rPr>
+          <w:lang w:val="en-IN"/>
+        </w:rPr>
+        <w:t>tcpdump</w:t>
+      </w:r>
+      <w:proofErr w:type="spellEnd"/>
+      <w:r>
+        <w:rPr>
+          <w:lang w:val="en-IN"/>
+        </w:rPr>
+        <w:t xml:space="preserve"> -w </w:t>
+      </w:r>
+      <w:proofErr w:type="spellStart"/>
+      <w:r>
+        <w:rPr>
+          <w:lang w:val="en-IN"/>
+        </w:rPr>
+        <w:t>traffic.pcap</w:t>
+      </w:r>
+      <w:proofErr w:type="spellEnd"/>
+      <w:r>
+        <w:rPr>
+          <w:lang w:val="en-IN"/>
+        </w:rPr>
+        <w:t xml:space="preserve"> '</w:t>
+      </w:r>
+      <w:proofErr w:type="spellStart"/>
+      <w:r>
+        <w:rPr>
+          <w:lang w:val="en-IN"/>
+        </w:rPr>
+        <w:t>tcp</w:t>
+      </w:r>
+      <w:proofErr w:type="spellEnd"/>
+      <w:r>
+        <w:rPr>
+          <w:lang w:val="en-IN"/>
+        </w:rPr>
+        <w:t xml:space="preserve"> port 8080'</w:t>
+      </w:r>
+      <w:r>
+        <w:rPr>
+          <w:lang w:val="en-IN"/>
+        </w:rPr>
+        <w:tab/>
+      </w:r>
+      <w:r>
+        <w:rPr>
+          <w:lang w:val="en-IN"/>
+        </w:rPr>
+        <w:t xml:space="preserve">-w </w:t>
+      </w:r>
+      <w:proofErr w:type="spellStart"/>
+      <w:r>
+        <w:rPr>
+          <w:lang w:val="en-IN"/>
+        </w:rPr>
+        <w:t>traffic.pcap</w:t>
+      </w:r>
+      <w:proofErr w:type="spellEnd"/>
+      <w:r>
+        <w:rPr>
+          <w:lang w:val="en-IN"/>
+        </w:rPr>
+        <w:t xml:space="preserve"> saves the captured packets into a file</w:t>
+      </w:r>
+    </w:p>
+    <w:p>
+      <w:pPr>
+        <w:pStyle w:val="NoSpacing"/>
+        <w:rPr>
+          <w:lang w:val="en-IN"/>
+        </w:rPr>
+      </w:pPr>
+      <w:proofErr w:type="spellStart"/>
+      <w:r>
+        <w:rPr>
+          <w:lang w:val="en-IN"/>
+        </w:rPr>
+        <w:t>tcpdump</w:t>
+      </w:r>
+      <w:proofErr w:type="spellEnd"/>
+      <w:r>
+        <w:rPr>
+          <w:lang w:val="en-IN"/>
+        </w:rPr>
+        <w:t xml:space="preserve"> -r </w:t>
+      </w:r>
+      <w:proofErr w:type="spellStart"/>
+      <w:r>
+        <w:rPr>
+          <w:lang w:val="en-IN"/>
+        </w:rPr>
+        <w:t>traffic.pcap</w:t>
+      </w:r>
+      <w:proofErr w:type="spellEnd"/>
+      <w:r>
+        <w:rPr>
+          <w:lang w:val="en-IN"/>
+        </w:rPr>
+        <w:t xml:space="preserve"> </w:t>
+      </w:r>
+      <w:r>
+        <w:rPr>
+          <w:lang w:val="en-IN"/>
+        </w:rPr>
+        <w:t>'</w:t>
+      </w:r>
+      <w:proofErr w:type="spellStart"/>
+      <w:r>
+        <w:rPr>
+          <w:lang w:val="en-IN"/>
+        </w:rPr>
+        <w:t>tcp</w:t>
+      </w:r>
+      <w:proofErr w:type="spellEnd"/>
+      <w:r>
+        <w:rPr>
+          <w:lang w:val="en-IN"/>
+        </w:rPr>
+        <w:t xml:space="preserve"> port 8080'</w:t>
+      </w:r>
+      <w:r>
+        <w:rPr>
+          <w:lang w:val="en-IN"/>
+        </w:rPr>
+        <w:tab/>
+      </w:r>
+      <w:r>
+        <w:rPr>
+          <w:lang w:val="en-IN"/>
+        </w:rPr>
+        <w:tab/>
+      </w:r>
+      <w:r>
+        <w:rPr>
+          <w:lang w:val="en-IN"/>
+        </w:rPr>
+        <w:t>Read the saved file</w:t>
+      </w:r>
+    </w:p>
+    <w:p>
+      <w:pPr>
+        <w:pStyle w:val="NoSpacing"/>
+        <w:rPr>
+          <w:lang w:val="en-IN"/>
+        </w:rPr>
+      </w:pPr>
+    </w:p>
+    <w:p>
+      <w:pPr>
+        <w:pStyle w:val="NoSpacing"/>
+        <w:rPr>
+          <w:lang w:val="en-IN"/>
+        </w:rPr>
+      </w:pPr>
+      <w:r>
+        <w:rPr>
+          <w:lang w:val="en-IN"/>
+        </w:rPr>
+        <w:t># HTTP GET requests (looking for "GET" in TCP payload)</w:t>
+      </w:r>
+    </w:p>
+    <w:p>
+      <w:pPr>
+        <w:pStyle w:val="NoSpacing"/>
+        <w:rPr>
+          <w:lang w:val="en-IN"/>
+        </w:rPr>
+      </w:pPr>
+      <w:proofErr w:type="spellStart"/>
+      <w:r>
+        <w:rPr>
+          <w:lang w:val="en-IN"/>
+        </w:rPr>
+        <w:t>sudo</w:t>
+      </w:r>
+      <w:proofErr w:type="spellEnd"/>
+      <w:r>
+        <w:rPr>
+          <w:lang w:val="en-IN"/>
+        </w:rPr>
+        <w:t xml:space="preserve"> </w:t>
+      </w:r>
+      <w:proofErr w:type="spellStart"/>
+      <w:r>
+        <w:rPr>
+          <w:lang w:val="en-IN"/>
+        </w:rPr>
+        <w:t>tcpdump</w:t>
+      </w:r>
+      <w:proofErr w:type="spellEnd"/>
+      <w:r>
+        <w:rPr>
+          <w:lang w:val="en-IN"/>
+        </w:rPr>
+        <w:t xml:space="preserve">  -n -A '</w:t>
+      </w:r>
+      <w:proofErr w:type="spellStart"/>
+      <w:r>
+        <w:rPr>
+          <w:lang w:val="en-IN"/>
+        </w:rPr>
+        <w:t>tcp</w:t>
+      </w:r>
+      <w:proofErr w:type="spellEnd"/>
+      <w:r>
+        <w:rPr>
+          <w:lang w:val="en-IN"/>
+        </w:rPr>
+        <w:t xml:space="preserve"> port 80 and (</w:t>
+      </w:r>
+      <w:proofErr w:type="spellStart"/>
+      <w:r>
+        <w:rPr>
+          <w:lang w:val="en-IN"/>
+        </w:rPr>
+        <w:t>tcp</w:t>
+      </w:r>
+      <w:proofErr w:type="spellEnd"/>
+      <w:r>
+        <w:rPr>
+          <w:lang w:val="en-IN"/>
+        </w:rPr>
+        <w:t>[((</w:t>
+      </w:r>
+      <w:proofErr w:type="spellStart"/>
+      <w:r>
+        <w:rPr>
+          <w:lang w:val="en-IN"/>
+        </w:rPr>
+        <w:t>tcp</w:t>
+      </w:r>
+      <w:proofErr w:type="spellEnd"/>
+      <w:r>
+        <w:rPr>
+          <w:lang w:val="en-IN"/>
+        </w:rPr>
+        <w:t>[12:1] &amp; 0xf0) &gt;&gt; 2):4] = 0x47455420)'</w:t>
+      </w:r>
+    </w:p>
+    <w:p>
+      <w:pPr>
+        <w:pStyle w:val="NoSpacing"/>
+        <w:rPr>
+          <w:lang w:val="en-IN"/>
+        </w:rPr>
+      </w:pPr>
+      <w:r>
+        <w:rPr>
+          <w:lang w:val="en-IN"/>
+        </w:rPr>
+        <w:t># 0x47455420 = "GET " in hex</w:t>
+      </w:r>
+    </w:p>
+    <w:p>
+      <w:pPr>
+        <w:pStyle w:val="NoSpacing"/>
+        <w:rPr>
+          <w:lang w:val="en-IN"/>
+        </w:rPr>
+      </w:pPr>
+    </w:p>
+    <w:p>
+      <w:pPr>
+        <w:pStyle w:val="NoSpacing"/>
+        <w:rPr>
+          <w:lang w:val="en-IN"/>
+        </w:rPr>
+      </w:pPr>
+    </w:p>
+    <w:p>
+      <w:pPr>
+        <w:pStyle w:val="NoSpacing"/>
+        <w:rPr>
+          <w:lang w:val="en-IN"/>
+        </w:rPr>
+      </w:pPr>
+    </w:p>
+    <w:p>
+      <w:pPr>
+        <w:pStyle w:val="NoSpacing"/>
+        <w:rPr>
+          <w:lang w:val="en-IN"/>
+        </w:rPr>
+      </w:pPr>
+    </w:p>
+    <w:p>
+      <w:pPr>
+        <w:pStyle w:val="NoSpacing"/>
+        <w:rPr>
+          <w:lang w:val="en-IN"/>
+        </w:rPr>
+      </w:pPr>
+      <w:r>
+        <w:rPr>
+          <w:lang w:val="en-IN"/>
+        </w:rPr>
+        <w:t xml:space="preserve">iii) What techniques allow extraction of specific HTTP header fields, such as Host, </w:t>
+      </w:r>
+      <w:proofErr w:type="spellStart"/>
+      <w:r>
+        <w:rPr>
+          <w:lang w:val="en-IN"/>
+        </w:rPr>
+        <w:t>User_agent</w:t>
+      </w:r>
+      <w:proofErr w:type="spellEnd"/>
+      <w:r>
+        <w:rPr>
+          <w:lang w:val="en-IN"/>
+        </w:rPr>
+        <w:t xml:space="preserve">, or </w:t>
+      </w:r>
+    </w:p>
+    <w:p>
+      <w:pPr>
+        <w:pStyle w:val="NoSpacing"/>
+        <w:rPr>
+          <w:lang w:val="en-IN"/>
+        </w:rPr>
+      </w:pPr>
+      <w:r>
+        <w:rPr>
+          <w:lang w:val="en-IN"/>
+        </w:rPr>
+        <w:t>the request URL?</w:t>
+      </w:r>
+    </w:p>
+    <w:p>
+      <w:pPr>
+        <w:pStyle w:val="NoSpacing"/>
+      </w:pPr>
+      <w:r>
+        <w:t>#</w:t>
+      </w:r>
+      <w:r>
+        <w:t>Capture traffic to/from a specific host</w:t>
+      </w:r>
+    </w:p>
+    <w:p>
+      <w:pPr>
+        <w:pStyle w:val="NoSpacing"/>
+        <w:rPr>
+          <w:lang w:val="en-IN"/>
+        </w:rPr>
+      </w:pPr>
+      <w:proofErr w:type="spellStart"/>
+      <w:r>
+        <w:rPr>
+          <w:lang w:val="en-IN"/>
+        </w:rPr>
+        <w:t>tcpdump</w:t>
+      </w:r>
+      <w:proofErr w:type="spellEnd"/>
+      <w:r>
+        <w:rPr>
+          <w:lang w:val="en-IN"/>
+        </w:rPr>
+        <w:t xml:space="preserve"> -n 'host 192.0.2.1'</w:t>
+      </w:r>
+      <w:r>
+        <w:rPr>
+          <w:lang w:val="en-IN"/>
+        </w:rPr>
+        <w:tab/>
+      </w:r>
+      <w:r>
+        <w:rPr>
+          <w:lang w:val="en-IN"/>
+        </w:rPr>
+        <w:tab/>
+      </w:r>
+      <w:r>
+        <w:rPr>
+          <w:lang w:val="en-IN"/>
+        </w:rPr>
+        <w:t>-n</w:t>
+      </w:r>
+      <w:r>
+        <w:rPr>
+          <w:lang w:val="en-IN"/>
+        </w:rPr>
+        <w:t xml:space="preserve"> </w:t>
+      </w:r>
+      <w:r>
+        <w:rPr>
+          <w:lang w:val="en-IN"/>
+        </w:rPr>
+        <w:t xml:space="preserve">Don't convert </w:t>
+      </w:r>
+      <w:proofErr w:type="spellStart"/>
+      <w:r>
+        <w:rPr>
+          <w:lang w:val="en-IN"/>
+        </w:rPr>
+        <w:t>addr</w:t>
+      </w:r>
+      <w:proofErr w:type="spellEnd"/>
+      <w:r>
+        <w:rPr>
+          <w:lang w:val="en-IN"/>
+        </w:rPr>
+        <w:t xml:space="preserve"> (host </w:t>
+      </w:r>
+      <w:proofErr w:type="spellStart"/>
+      <w:r>
+        <w:rPr>
+          <w:lang w:val="en-IN"/>
+        </w:rPr>
+        <w:t>addr</w:t>
+      </w:r>
+      <w:proofErr w:type="spellEnd"/>
+      <w:r>
+        <w:rPr>
+          <w:lang w:val="en-IN"/>
+        </w:rPr>
+        <w:t>, port numbers,) to names.</w:t>
+      </w:r>
+    </w:p>
+    <w:p>
+      <w:pPr>
+        <w:pStyle w:val="NoSpacing"/>
+        <w:rPr>
+          <w:lang w:val="en-IN"/>
+        </w:rPr>
+      </w:pPr>
+    </w:p>
+    <w:p>
+      <w:pPr>
+        <w:pStyle w:val="NoSpacing"/>
+        <w:rPr>
+          <w:lang w:val="en-IN"/>
+        </w:rPr>
+      </w:pPr>
+      <w:r>
+        <w:br/>
+      </w:r>
+      <w:r>
+        <w:rPr>
+          <w:lang w:val="en-IN"/>
+        </w:rPr>
+        <w:t>#</w:t>
+      </w:r>
+      <w:r>
+        <w:rPr>
+          <w:lang w:val="en-IN"/>
+        </w:rPr>
+        <w:t>Capture traffic on a specific port (HTTP)</w:t>
+      </w:r>
+    </w:p>
+    <w:p>
+      <w:pPr>
+        <w:pStyle w:val="NoSpacing"/>
+        <w:rPr>
+          <w:lang w:val="en-IN"/>
+        </w:rPr>
+      </w:pPr>
+      <w:proofErr w:type="spellStart"/>
+      <w:r>
+        <w:rPr>
+          <w:lang w:val="en-IN"/>
+        </w:rPr>
+        <w:t>tcpdump</w:t>
+      </w:r>
+      <w:proofErr w:type="spellEnd"/>
+      <w:r>
+        <w:rPr>
+          <w:lang w:val="en-IN"/>
+        </w:rPr>
+        <w:t xml:space="preserve"> -n 'port 8080'</w:t>
+      </w:r>
+    </w:p>
+    <w:p>
+      <w:pPr>
+        <w:pStyle w:val="NoSpacing"/>
+        <w:rPr>
+          <w:lang w:val="en-IN"/>
+        </w:rPr>
+      </w:pPr>
+      <w:r>
+        <w:rPr>
+          <w:lang w:val="en-IN"/>
+        </w:rPr>
+        <w:br/>
+      </w:r>
+      <w:r>
+        <w:rPr>
+          <w:lang w:val="en-IN"/>
+        </w:rPr>
+        <w:br/>
+      </w:r>
+    </w:p>
+    <w:p>
+      <w:pPr>
+        <w:pStyle w:val="NoSpacing"/>
+        <w:rPr>
+          <w:lang w:val="en-IN"/>
+        </w:rPr>
+      </w:pPr>
+    </w:p>
+    <w:p>
+      <w:pPr>
+        <w:pStyle w:val="NoSpacing"/>
+        <w:rPr>
+          <w:lang w:val="en-IN"/>
+        </w:rPr>
+      </w:pPr>
+    </w:p>
+    <w:p>
+      <w:pPr>
+        <w:pStyle w:val="NoSpacing"/>
+        <w:rPr>
+          <w:lang w:val="en-IN"/>
+        </w:rPr>
+      </w:pPr>
+      <w:r>
+        <w:rPr>
+          <w:lang w:val="en-IN"/>
+        </w:rPr>
+        <w:t>iv) How can the captured network traffic be summarized to highlight patterns in HTTP request</w:t>
+      </w:r>
+      <w:r>
+        <w:rPr>
+          <w:lang w:val="en-IN"/>
+        </w:rPr>
+        <w:t>response interactions, especially under heavy load?</w:t>
+      </w:r>
+      <w:r>
+        <w:rPr>
+          <w:lang w:val="en-IN"/>
+        </w:rPr>
+        <w:br/>
+      </w:r>
+      <w:r>
+        <w:rPr>
+          <w:lang w:val="en-IN"/>
+        </w:rPr>
+        <w:br/>
+      </w:r>
+    </w:p>
+    <w:p>
+      <w:pPr>
+        <w:pStyle w:val="NoSpacing"/>
+        <w:rPr>
+          <w:lang w:val="en-IN"/>
+        </w:rPr>
+      </w:pPr>
     </w:p>
     <w:p>
       <w:pPr>
@@ -3621,6 +4368,36 @@
       <w:spacing w:after="0" w:line="240" w:lineRule="auto"/>
     </w:pPr>
   </w:style>
+  <w:style w:type="paragraph" w:styleId="HTMLPreformatted">
+    <w:name w:val="HTML Preformatted"/>
+    <w:basedOn w:val="Normal"/>
+    <w:link w:val="HTMLPreformattedChar"/>
+    <w:uiPriority w:val="99"/>
+    <w:semiHidden/>
+    <w:unhideWhenUsed/>
+    <w:rsid w:val="00564758"/>
+    <w:pPr>
+      <w:spacing w:after="0" w:line="240" w:lineRule="auto"/>
+    </w:pPr>
+    <w:rPr>
+      <w:rFonts w:ascii="Consolas" w:hAnsi="Consolas"/>
+      <w:sz w:val="20"/>
+      <w:szCs w:val="20"/>
+    </w:rPr>
+  </w:style>
+  <w:style w:type="character" w:customStyle="1" w:styleId="HTMLPreformattedChar">
+    <w:name w:val="HTML Preformatted Char"/>
+    <w:basedOn w:val="DefaultParagraphFont"/>
+    <w:link w:val="HTMLPreformatted"/>
+    <w:uiPriority w:val="99"/>
+    <w:semiHidden/>
+    <w:rsid w:val="00564758"/>
+    <w:rPr>
+      <w:rFonts w:ascii="Consolas" w:hAnsi="Consolas"/>
+      <w:sz w:val="20"/>
+      <w:szCs w:val="20"/>
+    </w:rPr>
+  </w:style>
 </w:styles>
 </file>
 

</xml_diff>